<commit_message>
Añade navegación por Equipos/Deportes, corrige orden en MariaDB y terminología del Trofeo Alfonso
- Menú: nueva entrada 'Equipos' con selector de todos los equipos,
  igual que el ya existente para 'Deportes'.
- equipo.sql / deporte.sql: enlaces desde ambas vistas a la clasificación
  exacta de cada fila.
- Corrige un bug de orden: MariaDB, a diferencia de MySQL, no garantiza
  conservar el ORDER BY de una subconsulta sin LIMIT al pasar por una
  consulta exterior sin su propio ORDER BY. Afectaba a clasificacion.sql
  (liga y Trofeo Alfonso) y a deporte.sql/equipo.sql.
- Corrige la etiqueta de alfonso = -1 ('no clasifica' en el Trofeo
  Alfonso XIII, no una descalificación): ahora se muestra un guion en
  vez de 'DSQ'.
- Actualiza la memoria con las nuevas páginas/funcionalidades y
  renumera las figuras del capítulo 4.

Co-Authored-By: Claude Sonnet 5 <noreply@anthropic.com>
</commit_message>
<xml_diff>
--- a/TFG_Gabriel_Casado_Valcarcel.docx
+++ b/TFG_Gabriel_Casado_Valcarcel.docx
@@ -870,7 +870,15 @@
         <w:t>acompañando y</w:t>
       </w:r>
       <w:r>
-        <w:t xml:space="preserve"> apoyando, amigos de la carrera y de la universidad, a los que estuvieron, los que están  y los que seguirán estando. </w:t>
+        <w:t xml:space="preserve"> apoyando, amigos de la carrera y de la universidad, a los que estuvieron, los que </w:t>
+      </w:r>
+      <w:proofErr w:type="gramStart"/>
+      <w:r>
+        <w:t>están  y</w:t>
+      </w:r>
+      <w:proofErr w:type="gramEnd"/>
+      <w:r>
+        <w:t xml:space="preserve"> los que seguirán estando. </w:t>
       </w:r>
     </w:p>
     <w:p>
@@ -976,19 +984,11 @@
     <w:p>
       <w:pPr>
         <w:pStyle w:val="PageHeading"/>
-        <w:rPr>
-          <w:lang w:val="es-ES"/>
-        </w:rPr>
-      </w:pPr>
-      <w:proofErr w:type="spellStart"/>
-      <w:r>
-        <w:rPr>
-          <w:lang w:val="es-ES"/>
-        </w:rPr>
+      </w:pPr>
+      <w:r>
         <w:lastRenderedPageBreak/>
         <w:t>Abstract</w:t>
       </w:r>
-      <w:proofErr w:type="spellEnd"/>
     </w:p>
     <w:p>
       <w:pPr>
@@ -1027,7 +1027,21 @@
         <w:rPr>
           <w:lang w:val="en-US"/>
         </w:rPr>
-        <w:t xml:space="preserve">This Bachelor's Thesis presents the design, implementation and deployment of a system to </w:t>
+        <w:t xml:space="preserve">This </w:t>
+      </w:r>
+      <w:proofErr w:type="gramStart"/>
+      <w:r>
+        <w:rPr>
+          <w:lang w:val="en-US"/>
+        </w:rPr>
+        <w:t>Bachelor's</w:t>
+      </w:r>
+      <w:proofErr w:type="gramEnd"/>
+      <w:r>
+        <w:rPr>
+          <w:lang w:val="en-US"/>
+        </w:rPr>
+        <w:t xml:space="preserve"> Thesis presents the design, implementation and deployment of a system to </w:t>
       </w:r>
       <w:r>
         <w:rPr>
@@ -1235,7 +1249,7 @@
           <w:r>
             <w:fldChar w:fldCharType="separate"/>
           </w:r>
-          <w:hyperlink w:anchor="_Toc239546140" w:history="1">
+          <w:hyperlink w:anchor="_Toc239595804" w:history="1">
             <w:r>
               <w:rPr>
                 <w:rStyle w:val="Hipervnculo"/>
@@ -1262,7 +1276,7 @@
                 <w:noProof/>
                 <w:webHidden/>
               </w:rPr>
-              <w:instrText xml:space="preserve"> PAGEREF _Toc239546140 \h </w:instrText>
+              <w:instrText xml:space="preserve"> PAGEREF _Toc239595804 \h </w:instrText>
             </w:r>
             <w:r>
               <w:rPr>
@@ -1308,7 +1322,7 @@
               <w14:ligatures w14:val="standardContextual"/>
             </w:rPr>
           </w:pPr>
-          <w:hyperlink w:anchor="_Toc239546141" w:history="1">
+          <w:hyperlink w:anchor="_Toc239595805" w:history="1">
             <w:r>
               <w:rPr>
                 <w:rStyle w:val="Hipervnculo"/>
@@ -1335,7 +1349,7 @@
                 <w:noProof/>
                 <w:webHidden/>
               </w:rPr>
-              <w:instrText xml:space="preserve"> PAGEREF _Toc239546141 \h </w:instrText>
+              <w:instrText xml:space="preserve"> PAGEREF _Toc239595805 \h </w:instrText>
             </w:r>
             <w:r>
               <w:rPr>
@@ -1381,7 +1395,7 @@
               <w14:ligatures w14:val="standardContextual"/>
             </w:rPr>
           </w:pPr>
-          <w:hyperlink w:anchor="_Toc239546142" w:history="1">
+          <w:hyperlink w:anchor="_Toc239595806" w:history="1">
             <w:r>
               <w:rPr>
                 <w:rStyle w:val="Hipervnculo"/>
@@ -1408,7 +1422,7 @@
                 <w:noProof/>
                 <w:webHidden/>
               </w:rPr>
-              <w:instrText xml:space="preserve"> PAGEREF _Toc239546142 \h </w:instrText>
+              <w:instrText xml:space="preserve"> PAGEREF _Toc239595806 \h </w:instrText>
             </w:r>
             <w:r>
               <w:rPr>
@@ -1454,7 +1468,7 @@
               <w14:ligatures w14:val="standardContextual"/>
             </w:rPr>
           </w:pPr>
-          <w:hyperlink w:anchor="_Toc239546143" w:history="1">
+          <w:hyperlink w:anchor="_Toc239595807" w:history="1">
             <w:r>
               <w:rPr>
                 <w:rStyle w:val="Hipervnculo"/>
@@ -1481,7 +1495,7 @@
                 <w:noProof/>
                 <w:webHidden/>
               </w:rPr>
-              <w:instrText xml:space="preserve"> PAGEREF _Toc239546143 \h </w:instrText>
+              <w:instrText xml:space="preserve"> PAGEREF _Toc239595807 \h </w:instrText>
             </w:r>
             <w:r>
               <w:rPr>
@@ -1527,7 +1541,7 @@
               <w14:ligatures w14:val="standardContextual"/>
             </w:rPr>
           </w:pPr>
-          <w:hyperlink w:anchor="_Toc239546144" w:history="1">
+          <w:hyperlink w:anchor="_Toc239595808" w:history="1">
             <w:r>
               <w:rPr>
                 <w:rStyle w:val="Hipervnculo"/>
@@ -1554,7 +1568,7 @@
                 <w:noProof/>
                 <w:webHidden/>
               </w:rPr>
-              <w:instrText xml:space="preserve"> PAGEREF _Toc239546144 \h </w:instrText>
+              <w:instrText xml:space="preserve"> PAGEREF _Toc239595808 \h </w:instrText>
             </w:r>
             <w:r>
               <w:rPr>
@@ -1597,7 +1611,7 @@
               <w14:ligatures w14:val="standardContextual"/>
             </w:rPr>
           </w:pPr>
-          <w:hyperlink w:anchor="_Toc239546145" w:history="1">
+          <w:hyperlink w:anchor="_Toc239595809" w:history="1">
             <w:r>
               <w:rPr>
                 <w:rStyle w:val="Hipervnculo"/>
@@ -1625,7 +1639,7 @@
                 <w:noProof/>
                 <w:webHidden/>
               </w:rPr>
-              <w:instrText xml:space="preserve"> PAGEREF _Toc239546145 \h </w:instrText>
+              <w:instrText xml:space="preserve"> PAGEREF _Toc239595809 \h </w:instrText>
             </w:r>
             <w:r>
               <w:rPr>
@@ -1671,7 +1685,7 @@
               <w14:ligatures w14:val="standardContextual"/>
             </w:rPr>
           </w:pPr>
-          <w:hyperlink w:anchor="_Toc239546146" w:history="1">
+          <w:hyperlink w:anchor="_Toc239595810" w:history="1">
             <w:r>
               <w:rPr>
                 <w:rStyle w:val="Hipervnculo"/>
@@ -1706,7 +1720,7 @@
                 <w:noProof/>
                 <w:webHidden/>
               </w:rPr>
-              <w:instrText xml:space="preserve"> PAGEREF _Toc239546146 \h </w:instrText>
+              <w:instrText xml:space="preserve"> PAGEREF _Toc239595810 \h </w:instrText>
             </w:r>
             <w:r>
               <w:rPr>
@@ -1752,7 +1766,7 @@
               <w14:ligatures w14:val="standardContextual"/>
             </w:rPr>
           </w:pPr>
-          <w:hyperlink w:anchor="_Toc239546147" w:history="1">
+          <w:hyperlink w:anchor="_Toc239595811" w:history="1">
             <w:r>
               <w:rPr>
                 <w:rStyle w:val="Hipervnculo"/>
@@ -1787,7 +1801,7 @@
                 <w:noProof/>
                 <w:webHidden/>
               </w:rPr>
-              <w:instrText xml:space="preserve"> PAGEREF _Toc239546147 \h </w:instrText>
+              <w:instrText xml:space="preserve"> PAGEREF _Toc239595811 \h </w:instrText>
             </w:r>
             <w:r>
               <w:rPr>
@@ -1830,7 +1844,7 @@
               <w14:ligatures w14:val="standardContextual"/>
             </w:rPr>
           </w:pPr>
-          <w:hyperlink w:anchor="_Toc239546148" w:history="1">
+          <w:hyperlink w:anchor="_Toc239595812" w:history="1">
             <w:r>
               <w:rPr>
                 <w:rStyle w:val="Hipervnculo"/>
@@ -1865,7 +1879,7 @@
                 <w:noProof/>
                 <w:webHidden/>
               </w:rPr>
-              <w:instrText xml:space="preserve"> PAGEREF _Toc239546148 \h </w:instrText>
+              <w:instrText xml:space="preserve"> PAGEREF _Toc239595812 \h </w:instrText>
             </w:r>
             <w:r>
               <w:rPr>
@@ -1911,7 +1925,7 @@
               <w14:ligatures w14:val="standardContextual"/>
             </w:rPr>
           </w:pPr>
-          <w:hyperlink w:anchor="_Toc239546149" w:history="1">
+          <w:hyperlink w:anchor="_Toc239595813" w:history="1">
             <w:r>
               <w:rPr>
                 <w:rStyle w:val="Hipervnculo"/>
@@ -1946,7 +1960,7 @@
                 <w:noProof/>
                 <w:webHidden/>
               </w:rPr>
-              <w:instrText xml:space="preserve"> PAGEREF _Toc239546149 \h </w:instrText>
+              <w:instrText xml:space="preserve"> PAGEREF _Toc239595813 \h </w:instrText>
             </w:r>
             <w:r>
               <w:rPr>
@@ -1992,7 +2006,7 @@
               <w14:ligatures w14:val="standardContextual"/>
             </w:rPr>
           </w:pPr>
-          <w:hyperlink w:anchor="_Toc239546150" w:history="1">
+          <w:hyperlink w:anchor="_Toc239595814" w:history="1">
             <w:r>
               <w:rPr>
                 <w:rStyle w:val="Hipervnculo"/>
@@ -2027,7 +2041,7 @@
                 <w:noProof/>
                 <w:webHidden/>
               </w:rPr>
-              <w:instrText xml:space="preserve"> PAGEREF _Toc239546150 \h </w:instrText>
+              <w:instrText xml:space="preserve"> PAGEREF _Toc239595814 \h </w:instrText>
             </w:r>
             <w:r>
               <w:rPr>
@@ -2073,7 +2087,7 @@
               <w14:ligatures w14:val="standardContextual"/>
             </w:rPr>
           </w:pPr>
-          <w:hyperlink w:anchor="_Toc239546151" w:history="1">
+          <w:hyperlink w:anchor="_Toc239595815" w:history="1">
             <w:r>
               <w:rPr>
                 <w:rStyle w:val="Hipervnculo"/>
@@ -2108,7 +2122,7 @@
                 <w:noProof/>
                 <w:webHidden/>
               </w:rPr>
-              <w:instrText xml:space="preserve"> PAGEREF _Toc239546151 \h </w:instrText>
+              <w:instrText xml:space="preserve"> PAGEREF _Toc239595815 \h </w:instrText>
             </w:r>
             <w:r>
               <w:rPr>
@@ -2154,7 +2168,7 @@
               <w14:ligatures w14:val="standardContextual"/>
             </w:rPr>
           </w:pPr>
-          <w:hyperlink w:anchor="_Toc239546152" w:history="1">
+          <w:hyperlink w:anchor="_Toc239595816" w:history="1">
             <w:r>
               <w:rPr>
                 <w:rStyle w:val="Hipervnculo"/>
@@ -2189,7 +2203,7 @@
                 <w:noProof/>
                 <w:webHidden/>
               </w:rPr>
-              <w:instrText xml:space="preserve"> PAGEREF _Toc239546152 \h </w:instrText>
+              <w:instrText xml:space="preserve"> PAGEREF _Toc239595816 \h </w:instrText>
             </w:r>
             <w:r>
               <w:rPr>
@@ -2235,7 +2249,7 @@
               <w14:ligatures w14:val="standardContextual"/>
             </w:rPr>
           </w:pPr>
-          <w:hyperlink w:anchor="_Toc239546153" w:history="1">
+          <w:hyperlink w:anchor="_Toc239595817" w:history="1">
             <w:r>
               <w:rPr>
                 <w:rStyle w:val="Hipervnculo"/>
@@ -2270,7 +2284,7 @@
                 <w:noProof/>
                 <w:webHidden/>
               </w:rPr>
-              <w:instrText xml:space="preserve"> PAGEREF _Toc239546153 \h </w:instrText>
+              <w:instrText xml:space="preserve"> PAGEREF _Toc239595817 \h </w:instrText>
             </w:r>
             <w:r>
               <w:rPr>
@@ -2316,7 +2330,7 @@
               <w14:ligatures w14:val="standardContextual"/>
             </w:rPr>
           </w:pPr>
-          <w:hyperlink w:anchor="_Toc239546154" w:history="1">
+          <w:hyperlink w:anchor="_Toc239595818" w:history="1">
             <w:r>
               <w:rPr>
                 <w:rStyle w:val="Hipervnculo"/>
@@ -2351,7 +2365,7 @@
                 <w:noProof/>
                 <w:webHidden/>
               </w:rPr>
-              <w:instrText xml:space="preserve"> PAGEREF _Toc239546154 \h </w:instrText>
+              <w:instrText xml:space="preserve"> PAGEREF _Toc239595818 \h </w:instrText>
             </w:r>
             <w:r>
               <w:rPr>
@@ -2397,7 +2411,7 @@
               <w14:ligatures w14:val="standardContextual"/>
             </w:rPr>
           </w:pPr>
-          <w:hyperlink w:anchor="_Toc239546155" w:history="1">
+          <w:hyperlink w:anchor="_Toc239595819" w:history="1">
             <w:r>
               <w:rPr>
                 <w:rStyle w:val="Hipervnculo"/>
@@ -2432,7 +2446,7 @@
                 <w:noProof/>
                 <w:webHidden/>
               </w:rPr>
-              <w:instrText xml:space="preserve"> PAGEREF _Toc239546155 \h </w:instrText>
+              <w:instrText xml:space="preserve"> PAGEREF _Toc239595819 \h </w:instrText>
             </w:r>
             <w:r>
               <w:rPr>
@@ -2478,7 +2492,7 @@
               <w14:ligatures w14:val="standardContextual"/>
             </w:rPr>
           </w:pPr>
-          <w:hyperlink w:anchor="_Toc239546156" w:history="1">
+          <w:hyperlink w:anchor="_Toc239595820" w:history="1">
             <w:r>
               <w:rPr>
                 <w:rStyle w:val="Hipervnculo"/>
@@ -2513,7 +2527,7 @@
                 <w:noProof/>
                 <w:webHidden/>
               </w:rPr>
-              <w:instrText xml:space="preserve"> PAGEREF _Toc239546156 \h </w:instrText>
+              <w:instrText xml:space="preserve"> PAGEREF _Toc239595820 \h </w:instrText>
             </w:r>
             <w:r>
               <w:rPr>
@@ -2559,7 +2573,7 @@
               <w14:ligatures w14:val="standardContextual"/>
             </w:rPr>
           </w:pPr>
-          <w:hyperlink w:anchor="_Toc239546157" w:history="1">
+          <w:hyperlink w:anchor="_Toc239595821" w:history="1">
             <w:r>
               <w:rPr>
                 <w:rStyle w:val="Hipervnculo"/>
@@ -2594,7 +2608,7 @@
                 <w:noProof/>
                 <w:webHidden/>
               </w:rPr>
-              <w:instrText xml:space="preserve"> PAGEREF _Toc239546157 \h </w:instrText>
+              <w:instrText xml:space="preserve"> PAGEREF _Toc239595821 \h </w:instrText>
             </w:r>
             <w:r>
               <w:rPr>
@@ -2637,7 +2651,7 @@
               <w14:ligatures w14:val="standardContextual"/>
             </w:rPr>
           </w:pPr>
-          <w:hyperlink w:anchor="_Toc239546158" w:history="1">
+          <w:hyperlink w:anchor="_Toc239595822" w:history="1">
             <w:r>
               <w:rPr>
                 <w:rStyle w:val="Hipervnculo"/>
@@ -2672,7 +2686,7 @@
                 <w:noProof/>
                 <w:webHidden/>
               </w:rPr>
-              <w:instrText xml:space="preserve"> PAGEREF _Toc239546158 \h </w:instrText>
+              <w:instrText xml:space="preserve"> PAGEREF _Toc239595822 \h </w:instrText>
             </w:r>
             <w:r>
               <w:rPr>
@@ -2692,7 +2706,7 @@
                 <w:noProof/>
                 <w:webHidden/>
               </w:rPr>
-              <w:t>13</w:t>
+              <w:t>14</w:t>
             </w:r>
             <w:r>
               <w:rPr>
@@ -2718,7 +2732,7 @@
               <w14:ligatures w14:val="standardContextual"/>
             </w:rPr>
           </w:pPr>
-          <w:hyperlink w:anchor="_Toc239546159" w:history="1">
+          <w:hyperlink w:anchor="_Toc239595823" w:history="1">
             <w:r>
               <w:rPr>
                 <w:rStyle w:val="Hipervnculo"/>
@@ -2753,7 +2767,7 @@
                 <w:noProof/>
                 <w:webHidden/>
               </w:rPr>
-              <w:instrText xml:space="preserve"> PAGEREF _Toc239546159 \h </w:instrText>
+              <w:instrText xml:space="preserve"> PAGEREF _Toc239595823 \h </w:instrText>
             </w:r>
             <w:r>
               <w:rPr>
@@ -2773,7 +2787,7 @@
                 <w:noProof/>
                 <w:webHidden/>
               </w:rPr>
-              <w:t>13</w:t>
+              <w:t>15</w:t>
             </w:r>
             <w:r>
               <w:rPr>
@@ -2799,7 +2813,7 @@
               <w14:ligatures w14:val="standardContextual"/>
             </w:rPr>
           </w:pPr>
-          <w:hyperlink w:anchor="_Toc239546160" w:history="1">
+          <w:hyperlink w:anchor="_Toc239595824" w:history="1">
             <w:r>
               <w:rPr>
                 <w:rStyle w:val="Hipervnculo"/>
@@ -2834,7 +2848,7 @@
                 <w:noProof/>
                 <w:webHidden/>
               </w:rPr>
-              <w:instrText xml:space="preserve"> PAGEREF _Toc239546160 \h </w:instrText>
+              <w:instrText xml:space="preserve"> PAGEREF _Toc239595824 \h </w:instrText>
             </w:r>
             <w:r>
               <w:rPr>
@@ -2854,7 +2868,7 @@
                 <w:noProof/>
                 <w:webHidden/>
               </w:rPr>
-              <w:t>14</w:t>
+              <w:t>15</w:t>
             </w:r>
             <w:r>
               <w:rPr>
@@ -2880,7 +2894,7 @@
               <w14:ligatures w14:val="standardContextual"/>
             </w:rPr>
           </w:pPr>
-          <w:hyperlink w:anchor="_Toc239546161" w:history="1">
+          <w:hyperlink w:anchor="_Toc239595825" w:history="1">
             <w:r>
               <w:rPr>
                 <w:rStyle w:val="Hipervnculo"/>
@@ -2915,7 +2929,7 @@
                 <w:noProof/>
                 <w:webHidden/>
               </w:rPr>
-              <w:instrText xml:space="preserve"> PAGEREF _Toc239546161 \h </w:instrText>
+              <w:instrText xml:space="preserve"> PAGEREF _Toc239595825 \h </w:instrText>
             </w:r>
             <w:r>
               <w:rPr>
@@ -2935,7 +2949,7 @@
                 <w:noProof/>
                 <w:webHidden/>
               </w:rPr>
-              <w:t>15</w:t>
+              <w:t>16</w:t>
             </w:r>
             <w:r>
               <w:rPr>
@@ -2961,7 +2975,7 @@
               <w14:ligatures w14:val="standardContextual"/>
             </w:rPr>
           </w:pPr>
-          <w:hyperlink w:anchor="_Toc239546162" w:history="1">
+          <w:hyperlink w:anchor="_Toc239595826" w:history="1">
             <w:r>
               <w:rPr>
                 <w:rStyle w:val="Hipervnculo"/>
@@ -2996,7 +3010,7 @@
                 <w:noProof/>
                 <w:webHidden/>
               </w:rPr>
-              <w:instrText xml:space="preserve"> PAGEREF _Toc239546162 \h </w:instrText>
+              <w:instrText xml:space="preserve"> PAGEREF _Toc239595826 \h </w:instrText>
             </w:r>
             <w:r>
               <w:rPr>
@@ -3016,7 +3030,7 @@
                 <w:noProof/>
                 <w:webHidden/>
               </w:rPr>
-              <w:t>15</w:t>
+              <w:t>16</w:t>
             </w:r>
             <w:r>
               <w:rPr>
@@ -3042,7 +3056,7 @@
               <w14:ligatures w14:val="standardContextual"/>
             </w:rPr>
           </w:pPr>
-          <w:hyperlink w:anchor="_Toc239546163" w:history="1">
+          <w:hyperlink w:anchor="_Toc239595827" w:history="1">
             <w:r>
               <w:rPr>
                 <w:rStyle w:val="Hipervnculo"/>
@@ -3077,7 +3091,7 @@
                 <w:noProof/>
                 <w:webHidden/>
               </w:rPr>
-              <w:instrText xml:space="preserve"> PAGEREF _Toc239546163 \h </w:instrText>
+              <w:instrText xml:space="preserve"> PAGEREF _Toc239595827 \h </w:instrText>
             </w:r>
             <w:r>
               <w:rPr>
@@ -3097,7 +3111,7 @@
                 <w:noProof/>
                 <w:webHidden/>
               </w:rPr>
-              <w:t>15</w:t>
+              <w:t>16</w:t>
             </w:r>
             <w:r>
               <w:rPr>
@@ -3123,7 +3137,7 @@
               <w14:ligatures w14:val="standardContextual"/>
             </w:rPr>
           </w:pPr>
-          <w:hyperlink w:anchor="_Toc239546164" w:history="1">
+          <w:hyperlink w:anchor="_Toc239595828" w:history="1">
             <w:r>
               <w:rPr>
                 <w:rStyle w:val="Hipervnculo"/>
@@ -3158,7 +3172,7 @@
                 <w:noProof/>
                 <w:webHidden/>
               </w:rPr>
-              <w:instrText xml:space="preserve"> PAGEREF _Toc239546164 \h </w:instrText>
+              <w:instrText xml:space="preserve"> PAGEREF _Toc239595828 \h </w:instrText>
             </w:r>
             <w:r>
               <w:rPr>
@@ -3178,7 +3192,7 @@
                 <w:noProof/>
                 <w:webHidden/>
               </w:rPr>
-              <w:t>16</w:t>
+              <w:t>17</w:t>
             </w:r>
             <w:r>
               <w:rPr>
@@ -3204,7 +3218,7 @@
               <w14:ligatures w14:val="standardContextual"/>
             </w:rPr>
           </w:pPr>
-          <w:hyperlink w:anchor="_Toc239546165" w:history="1">
+          <w:hyperlink w:anchor="_Toc239595829" w:history="1">
             <w:r>
               <w:rPr>
                 <w:rStyle w:val="Hipervnculo"/>
@@ -3239,7 +3253,7 @@
                 <w:noProof/>
                 <w:webHidden/>
               </w:rPr>
-              <w:instrText xml:space="preserve"> PAGEREF _Toc239546165 \h </w:instrText>
+              <w:instrText xml:space="preserve"> PAGEREF _Toc239595829 \h </w:instrText>
             </w:r>
             <w:r>
               <w:rPr>
@@ -3259,7 +3273,7 @@
                 <w:noProof/>
                 <w:webHidden/>
               </w:rPr>
-              <w:t>16</w:t>
+              <w:t>18</w:t>
             </w:r>
             <w:r>
               <w:rPr>
@@ -3285,7 +3299,7 @@
               <w14:ligatures w14:val="standardContextual"/>
             </w:rPr>
           </w:pPr>
-          <w:hyperlink w:anchor="_Toc239546166" w:history="1">
+          <w:hyperlink w:anchor="_Toc239595830" w:history="1">
             <w:r>
               <w:rPr>
                 <w:rStyle w:val="Hipervnculo"/>
@@ -3320,7 +3334,7 @@
                 <w:noProof/>
                 <w:webHidden/>
               </w:rPr>
-              <w:instrText xml:space="preserve"> PAGEREF _Toc239546166 \h </w:instrText>
+              <w:instrText xml:space="preserve"> PAGEREF _Toc239595830 \h </w:instrText>
             </w:r>
             <w:r>
               <w:rPr>
@@ -3340,7 +3354,7 @@
                 <w:noProof/>
                 <w:webHidden/>
               </w:rPr>
-              <w:t>16</w:t>
+              <w:t>21</w:t>
             </w:r>
             <w:r>
               <w:rPr>
@@ -3366,7 +3380,7 @@
               <w14:ligatures w14:val="standardContextual"/>
             </w:rPr>
           </w:pPr>
-          <w:hyperlink w:anchor="_Toc239546167" w:history="1">
+          <w:hyperlink w:anchor="_Toc239595831" w:history="1">
             <w:r>
               <w:rPr>
                 <w:rStyle w:val="Hipervnculo"/>
@@ -3401,7 +3415,7 @@
                 <w:noProof/>
                 <w:webHidden/>
               </w:rPr>
-              <w:instrText xml:space="preserve"> PAGEREF _Toc239546167 \h </w:instrText>
+              <w:instrText xml:space="preserve"> PAGEREF _Toc239595831 \h </w:instrText>
             </w:r>
             <w:r>
               <w:rPr>
@@ -3421,7 +3435,7 @@
                 <w:noProof/>
                 <w:webHidden/>
               </w:rPr>
-              <w:t>16</w:t>
+              <w:t>22</w:t>
             </w:r>
             <w:r>
               <w:rPr>
@@ -3447,7 +3461,7 @@
               <w14:ligatures w14:val="standardContextual"/>
             </w:rPr>
           </w:pPr>
-          <w:hyperlink w:anchor="_Toc239546168" w:history="1">
+          <w:hyperlink w:anchor="_Toc239595832" w:history="1">
             <w:r>
               <w:rPr>
                 <w:rStyle w:val="Hipervnculo"/>
@@ -3482,7 +3496,7 @@
                 <w:noProof/>
                 <w:webHidden/>
               </w:rPr>
-              <w:instrText xml:space="preserve"> PAGEREF _Toc239546168 \h </w:instrText>
+              <w:instrText xml:space="preserve"> PAGEREF _Toc239595832 \h </w:instrText>
             </w:r>
             <w:r>
               <w:rPr>
@@ -3502,7 +3516,7 @@
                 <w:noProof/>
                 <w:webHidden/>
               </w:rPr>
-              <w:t>17</w:t>
+              <w:t>23</w:t>
             </w:r>
             <w:r>
               <w:rPr>
@@ -3528,7 +3542,7 @@
               <w14:ligatures w14:val="standardContextual"/>
             </w:rPr>
           </w:pPr>
-          <w:hyperlink w:anchor="_Toc239546169" w:history="1">
+          <w:hyperlink w:anchor="_Toc239595833" w:history="1">
             <w:r>
               <w:rPr>
                 <w:rStyle w:val="Hipervnculo"/>
@@ -3563,7 +3577,7 @@
                 <w:noProof/>
                 <w:webHidden/>
               </w:rPr>
-              <w:instrText xml:space="preserve"> PAGEREF _Toc239546169 \h </w:instrText>
+              <w:instrText xml:space="preserve"> PAGEREF _Toc239595833 \h </w:instrText>
             </w:r>
             <w:r>
               <w:rPr>
@@ -3583,7 +3597,7 @@
                 <w:noProof/>
                 <w:webHidden/>
               </w:rPr>
-              <w:t>17</w:t>
+              <w:t>23</w:t>
             </w:r>
             <w:r>
               <w:rPr>
@@ -3606,7 +3620,7 @@
               <w14:ligatures w14:val="standardContextual"/>
             </w:rPr>
           </w:pPr>
-          <w:hyperlink w:anchor="_Toc239546170" w:history="1">
+          <w:hyperlink w:anchor="_Toc239595834" w:history="1">
             <w:r>
               <w:rPr>
                 <w:rStyle w:val="Hipervnculo"/>
@@ -3641,7 +3655,7 @@
                 <w:noProof/>
                 <w:webHidden/>
               </w:rPr>
-              <w:instrText xml:space="preserve"> PAGEREF _Toc239546170 \h </w:instrText>
+              <w:instrText xml:space="preserve"> PAGEREF _Toc239595834 \h </w:instrText>
             </w:r>
             <w:r>
               <w:rPr>
@@ -3661,7 +3675,7 @@
                 <w:noProof/>
                 <w:webHidden/>
               </w:rPr>
-              <w:t>18</w:t>
+              <w:t>24</w:t>
             </w:r>
             <w:r>
               <w:rPr>
@@ -3687,7 +3701,7 @@
               <w14:ligatures w14:val="standardContextual"/>
             </w:rPr>
           </w:pPr>
-          <w:hyperlink w:anchor="_Toc239546171" w:history="1">
+          <w:hyperlink w:anchor="_Toc239595835" w:history="1">
             <w:r>
               <w:rPr>
                 <w:rStyle w:val="Hipervnculo"/>
@@ -3722,7 +3736,7 @@
                 <w:noProof/>
                 <w:webHidden/>
               </w:rPr>
-              <w:instrText xml:space="preserve"> PAGEREF _Toc239546171 \h </w:instrText>
+              <w:instrText xml:space="preserve"> PAGEREF _Toc239595835 \h </w:instrText>
             </w:r>
             <w:r>
               <w:rPr>
@@ -3742,7 +3756,7 @@
                 <w:noProof/>
                 <w:webHidden/>
               </w:rPr>
-              <w:t>18</w:t>
+              <w:t>24</w:t>
             </w:r>
             <w:r>
               <w:rPr>
@@ -3768,7 +3782,7 @@
               <w14:ligatures w14:val="standardContextual"/>
             </w:rPr>
           </w:pPr>
-          <w:hyperlink w:anchor="_Toc239546172" w:history="1">
+          <w:hyperlink w:anchor="_Toc239595836" w:history="1">
             <w:r>
               <w:rPr>
                 <w:rStyle w:val="Hipervnculo"/>
@@ -3803,7 +3817,7 @@
                 <w:noProof/>
                 <w:webHidden/>
               </w:rPr>
-              <w:instrText xml:space="preserve"> PAGEREF _Toc239546172 \h </w:instrText>
+              <w:instrText xml:space="preserve"> PAGEREF _Toc239595836 \h </w:instrText>
             </w:r>
             <w:r>
               <w:rPr>
@@ -3823,7 +3837,7 @@
                 <w:noProof/>
                 <w:webHidden/>
               </w:rPr>
-              <w:t>18</w:t>
+              <w:t>24</w:t>
             </w:r>
             <w:r>
               <w:rPr>
@@ -3849,7 +3863,7 @@
               <w14:ligatures w14:val="standardContextual"/>
             </w:rPr>
           </w:pPr>
-          <w:hyperlink w:anchor="_Toc239546173" w:history="1">
+          <w:hyperlink w:anchor="_Toc239595837" w:history="1">
             <w:r>
               <w:rPr>
                 <w:rStyle w:val="Hipervnculo"/>
@@ -3884,7 +3898,7 @@
                 <w:noProof/>
                 <w:webHidden/>
               </w:rPr>
-              <w:instrText xml:space="preserve"> PAGEREF _Toc239546173 \h </w:instrText>
+              <w:instrText xml:space="preserve"> PAGEREF _Toc239595837 \h </w:instrText>
             </w:r>
             <w:r>
               <w:rPr>
@@ -3904,7 +3918,7 @@
                 <w:noProof/>
                 <w:webHidden/>
               </w:rPr>
-              <w:t>18</w:t>
+              <w:t>24</w:t>
             </w:r>
             <w:r>
               <w:rPr>
@@ -3930,7 +3944,7 @@
               <w14:ligatures w14:val="standardContextual"/>
             </w:rPr>
           </w:pPr>
-          <w:hyperlink w:anchor="_Toc239546174" w:history="1">
+          <w:hyperlink w:anchor="_Toc239595838" w:history="1">
             <w:r>
               <w:rPr>
                 <w:rStyle w:val="Hipervnculo"/>
@@ -3965,7 +3979,7 @@
                 <w:noProof/>
                 <w:webHidden/>
               </w:rPr>
-              <w:instrText xml:space="preserve"> PAGEREF _Toc239546174 \h </w:instrText>
+              <w:instrText xml:space="preserve"> PAGEREF _Toc239595838 \h </w:instrText>
             </w:r>
             <w:r>
               <w:rPr>
@@ -3985,7 +3999,7 @@
                 <w:noProof/>
                 <w:webHidden/>
               </w:rPr>
-              <w:t>19</w:t>
+              <w:t>25</w:t>
             </w:r>
             <w:r>
               <w:rPr>
@@ -4008,7 +4022,7 @@
               <w14:ligatures w14:val="standardContextual"/>
             </w:rPr>
           </w:pPr>
-          <w:hyperlink w:anchor="_Toc239546175" w:history="1">
+          <w:hyperlink w:anchor="_Toc239595839" w:history="1">
             <w:r>
               <w:rPr>
                 <w:rStyle w:val="Hipervnculo"/>
@@ -4043,7 +4057,7 @@
                 <w:noProof/>
                 <w:webHidden/>
               </w:rPr>
-              <w:instrText xml:space="preserve"> PAGEREF _Toc239546175 \h </w:instrText>
+              <w:instrText xml:space="preserve"> PAGEREF _Toc239595839 \h </w:instrText>
             </w:r>
             <w:r>
               <w:rPr>
@@ -4063,7 +4077,7 @@
                 <w:noProof/>
                 <w:webHidden/>
               </w:rPr>
-              <w:t>20</w:t>
+              <w:t>26</w:t>
             </w:r>
             <w:r>
               <w:rPr>
@@ -4089,7 +4103,7 @@
               <w14:ligatures w14:val="standardContextual"/>
             </w:rPr>
           </w:pPr>
-          <w:hyperlink w:anchor="_Toc239546176" w:history="1">
+          <w:hyperlink w:anchor="_Toc239595840" w:history="1">
             <w:r>
               <w:rPr>
                 <w:rStyle w:val="Hipervnculo"/>
@@ -4124,7 +4138,7 @@
                 <w:noProof/>
                 <w:webHidden/>
               </w:rPr>
-              <w:instrText xml:space="preserve"> PAGEREF _Toc239546176 \h </w:instrText>
+              <w:instrText xml:space="preserve"> PAGEREF _Toc239595840 \h </w:instrText>
             </w:r>
             <w:r>
               <w:rPr>
@@ -4144,7 +4158,7 @@
                 <w:noProof/>
                 <w:webHidden/>
               </w:rPr>
-              <w:t>20</w:t>
+              <w:t>26</w:t>
             </w:r>
             <w:r>
               <w:rPr>
@@ -4170,7 +4184,7 @@
               <w14:ligatures w14:val="standardContextual"/>
             </w:rPr>
           </w:pPr>
-          <w:hyperlink w:anchor="_Toc239546177" w:history="1">
+          <w:hyperlink w:anchor="_Toc239595841" w:history="1">
             <w:r>
               <w:rPr>
                 <w:rStyle w:val="Hipervnculo"/>
@@ -4205,7 +4219,7 @@
                 <w:noProof/>
                 <w:webHidden/>
               </w:rPr>
-              <w:instrText xml:space="preserve"> PAGEREF _Toc239546177 \h </w:instrText>
+              <w:instrText xml:space="preserve"> PAGEREF _Toc239595841 \h </w:instrText>
             </w:r>
             <w:r>
               <w:rPr>
@@ -4225,7 +4239,7 @@
                 <w:noProof/>
                 <w:webHidden/>
               </w:rPr>
-              <w:t>20</w:t>
+              <w:t>26</w:t>
             </w:r>
             <w:r>
               <w:rPr>
@@ -4251,7 +4265,7 @@
               <w14:ligatures w14:val="standardContextual"/>
             </w:rPr>
           </w:pPr>
-          <w:hyperlink w:anchor="_Toc239546178" w:history="1">
+          <w:hyperlink w:anchor="_Toc239595842" w:history="1">
             <w:r>
               <w:rPr>
                 <w:rStyle w:val="Hipervnculo"/>
@@ -4286,7 +4300,7 @@
                 <w:noProof/>
                 <w:webHidden/>
               </w:rPr>
-              <w:instrText xml:space="preserve"> PAGEREF _Toc239546178 \h </w:instrText>
+              <w:instrText xml:space="preserve"> PAGEREF _Toc239595842 \h </w:instrText>
             </w:r>
             <w:r>
               <w:rPr>
@@ -4306,7 +4320,7 @@
                 <w:noProof/>
                 <w:webHidden/>
               </w:rPr>
-              <w:t>20</w:t>
+              <w:t>26</w:t>
             </w:r>
             <w:r>
               <w:rPr>
@@ -4332,7 +4346,7 @@
               <w14:ligatures w14:val="standardContextual"/>
             </w:rPr>
           </w:pPr>
-          <w:hyperlink w:anchor="_Toc239546179" w:history="1">
+          <w:hyperlink w:anchor="_Toc239595843" w:history="1">
             <w:r>
               <w:rPr>
                 <w:rStyle w:val="Hipervnculo"/>
@@ -4367,7 +4381,7 @@
                 <w:noProof/>
                 <w:webHidden/>
               </w:rPr>
-              <w:instrText xml:space="preserve"> PAGEREF _Toc239546179 \h </w:instrText>
+              <w:instrText xml:space="preserve"> PAGEREF _Toc239595843 \h </w:instrText>
             </w:r>
             <w:r>
               <w:rPr>
@@ -4387,7 +4401,7 @@
                 <w:noProof/>
                 <w:webHidden/>
               </w:rPr>
-              <w:t>21</w:t>
+              <w:t>27</w:t>
             </w:r>
             <w:r>
               <w:rPr>
@@ -4413,7 +4427,7 @@
               <w14:ligatures w14:val="standardContextual"/>
             </w:rPr>
           </w:pPr>
-          <w:hyperlink w:anchor="_Toc239546180" w:history="1">
+          <w:hyperlink w:anchor="_Toc239595844" w:history="1">
             <w:r>
               <w:rPr>
                 <w:rStyle w:val="Hipervnculo"/>
@@ -4448,7 +4462,7 @@
                 <w:noProof/>
                 <w:webHidden/>
               </w:rPr>
-              <w:instrText xml:space="preserve"> PAGEREF _Toc239546180 \h </w:instrText>
+              <w:instrText xml:space="preserve"> PAGEREF _Toc239595844 \h </w:instrText>
             </w:r>
             <w:r>
               <w:rPr>
@@ -4468,7 +4482,7 @@
                 <w:noProof/>
                 <w:webHidden/>
               </w:rPr>
-              <w:t>21</w:t>
+              <w:t>27</w:t>
             </w:r>
             <w:r>
               <w:rPr>
@@ -4494,7 +4508,7 @@
               <w14:ligatures w14:val="standardContextual"/>
             </w:rPr>
           </w:pPr>
-          <w:hyperlink w:anchor="_Toc239546181" w:history="1">
+          <w:hyperlink w:anchor="_Toc239595845" w:history="1">
             <w:r>
               <w:rPr>
                 <w:rStyle w:val="Hipervnculo"/>
@@ -4529,7 +4543,7 @@
                 <w:noProof/>
                 <w:webHidden/>
               </w:rPr>
-              <w:instrText xml:space="preserve"> PAGEREF _Toc239546181 \h </w:instrText>
+              <w:instrText xml:space="preserve"> PAGEREF _Toc239595845 \h </w:instrText>
             </w:r>
             <w:r>
               <w:rPr>
@@ -4549,7 +4563,7 @@
                 <w:noProof/>
                 <w:webHidden/>
               </w:rPr>
-              <w:t>21</w:t>
+              <w:t>27</w:t>
             </w:r>
             <w:r>
               <w:rPr>
@@ -4572,7 +4586,7 @@
               <w14:ligatures w14:val="standardContextual"/>
             </w:rPr>
           </w:pPr>
-          <w:hyperlink w:anchor="_Toc239546182" w:history="1">
+          <w:hyperlink w:anchor="_Toc239595846" w:history="1">
             <w:r>
               <w:rPr>
                 <w:rStyle w:val="Hipervnculo"/>
@@ -4607,7 +4621,7 @@
                 <w:noProof/>
                 <w:webHidden/>
               </w:rPr>
-              <w:instrText xml:space="preserve"> PAGEREF _Toc239546182 \h </w:instrText>
+              <w:instrText xml:space="preserve"> PAGEREF _Toc239595846 \h </w:instrText>
             </w:r>
             <w:r>
               <w:rPr>
@@ -4627,7 +4641,7 @@
                 <w:noProof/>
                 <w:webHidden/>
               </w:rPr>
-              <w:t>22</w:t>
+              <w:t>28</w:t>
             </w:r>
             <w:r>
               <w:rPr>
@@ -4653,7 +4667,7 @@
               <w14:ligatures w14:val="standardContextual"/>
             </w:rPr>
           </w:pPr>
-          <w:hyperlink w:anchor="_Toc239546183" w:history="1">
+          <w:hyperlink w:anchor="_Toc239595847" w:history="1">
             <w:r>
               <w:rPr>
                 <w:rStyle w:val="Hipervnculo"/>
@@ -4688,7 +4702,7 @@
                 <w:noProof/>
                 <w:webHidden/>
               </w:rPr>
-              <w:instrText xml:space="preserve"> PAGEREF _Toc239546183 \h </w:instrText>
+              <w:instrText xml:space="preserve"> PAGEREF _Toc239595847 \h </w:instrText>
             </w:r>
             <w:r>
               <w:rPr>
@@ -4708,7 +4722,7 @@
                 <w:noProof/>
                 <w:webHidden/>
               </w:rPr>
-              <w:t>22</w:t>
+              <w:t>28</w:t>
             </w:r>
             <w:r>
               <w:rPr>
@@ -4734,7 +4748,7 @@
               <w14:ligatures w14:val="standardContextual"/>
             </w:rPr>
           </w:pPr>
-          <w:hyperlink w:anchor="_Toc239546184" w:history="1">
+          <w:hyperlink w:anchor="_Toc239595848" w:history="1">
             <w:r>
               <w:rPr>
                 <w:rStyle w:val="Hipervnculo"/>
@@ -4769,7 +4783,7 @@
                 <w:noProof/>
                 <w:webHidden/>
               </w:rPr>
-              <w:instrText xml:space="preserve"> PAGEREF _Toc239546184 \h </w:instrText>
+              <w:instrText xml:space="preserve"> PAGEREF _Toc239595848 \h </w:instrText>
             </w:r>
             <w:r>
               <w:rPr>
@@ -4789,7 +4803,7 @@
                 <w:noProof/>
                 <w:webHidden/>
               </w:rPr>
-              <w:t>22</w:t>
+              <w:t>28</w:t>
             </w:r>
             <w:r>
               <w:rPr>
@@ -4815,7 +4829,7 @@
               <w14:ligatures w14:val="standardContextual"/>
             </w:rPr>
           </w:pPr>
-          <w:hyperlink w:anchor="_Toc239546185" w:history="1">
+          <w:hyperlink w:anchor="_Toc239595849" w:history="1">
             <w:r>
               <w:rPr>
                 <w:rStyle w:val="Hipervnculo"/>
@@ -4850,7 +4864,7 @@
                 <w:noProof/>
                 <w:webHidden/>
               </w:rPr>
-              <w:instrText xml:space="preserve"> PAGEREF _Toc239546185 \h </w:instrText>
+              <w:instrText xml:space="preserve"> PAGEREF _Toc239595849 \h </w:instrText>
             </w:r>
             <w:r>
               <w:rPr>
@@ -4870,7 +4884,7 @@
                 <w:noProof/>
                 <w:webHidden/>
               </w:rPr>
-              <w:t>23</w:t>
+              <w:t>29</w:t>
             </w:r>
             <w:r>
               <w:rPr>
@@ -4893,7 +4907,7 @@
               <w14:ligatures w14:val="standardContextual"/>
             </w:rPr>
           </w:pPr>
-          <w:hyperlink w:anchor="_Toc239546186" w:history="1">
+          <w:hyperlink w:anchor="_Toc239595850" w:history="1">
             <w:r>
               <w:rPr>
                 <w:rStyle w:val="Hipervnculo"/>
@@ -4928,7 +4942,7 @@
                 <w:noProof/>
                 <w:webHidden/>
               </w:rPr>
-              <w:instrText xml:space="preserve"> PAGEREF _Toc239546186 \h </w:instrText>
+              <w:instrText xml:space="preserve"> PAGEREF _Toc239595850 \h </w:instrText>
             </w:r>
             <w:r>
               <w:rPr>
@@ -4948,7 +4962,7 @@
                 <w:noProof/>
                 <w:webHidden/>
               </w:rPr>
-              <w:t>25</w:t>
+              <w:t>31</w:t>
             </w:r>
             <w:r>
               <w:rPr>
@@ -4971,7 +4985,7 @@
               <w14:ligatures w14:val="standardContextual"/>
             </w:rPr>
           </w:pPr>
-          <w:hyperlink w:anchor="_Toc239546187" w:history="1">
+          <w:hyperlink w:anchor="_Toc239595851" w:history="1">
             <w:r>
               <w:rPr>
                 <w:rStyle w:val="Hipervnculo"/>
@@ -4998,7 +5012,7 @@
                 <w:noProof/>
                 <w:webHidden/>
               </w:rPr>
-              <w:instrText xml:space="preserve"> PAGEREF _Toc239546187 \h </w:instrText>
+              <w:instrText xml:space="preserve"> PAGEREF _Toc239595851 \h </w:instrText>
             </w:r>
             <w:r>
               <w:rPr>
@@ -5018,7 +5032,7 @@
                 <w:noProof/>
                 <w:webHidden/>
               </w:rPr>
-              <w:t>27</w:t>
+              <w:t>33</w:t>
             </w:r>
             <w:r>
               <w:rPr>
@@ -5041,7 +5055,7 @@
               <w14:ligatures w14:val="standardContextual"/>
             </w:rPr>
           </w:pPr>
-          <w:hyperlink w:anchor="_Toc239546188" w:history="1">
+          <w:hyperlink w:anchor="_Toc239595852" w:history="1">
             <w:r>
               <w:rPr>
                 <w:rStyle w:val="Hipervnculo"/>
@@ -5068,7 +5082,7 @@
                 <w:noProof/>
                 <w:webHidden/>
               </w:rPr>
-              <w:instrText xml:space="preserve"> PAGEREF _Toc239546188 \h </w:instrText>
+              <w:instrText xml:space="preserve"> PAGEREF _Toc239595852 \h </w:instrText>
             </w:r>
             <w:r>
               <w:rPr>
@@ -5088,7 +5102,7 @@
                 <w:noProof/>
                 <w:webHidden/>
               </w:rPr>
-              <w:t>29</w:t>
+              <w:t>35</w:t>
             </w:r>
             <w:r>
               <w:rPr>
@@ -5111,7 +5125,7 @@
               <w14:ligatures w14:val="standardContextual"/>
             </w:rPr>
           </w:pPr>
-          <w:hyperlink w:anchor="_Toc239546189" w:history="1">
+          <w:hyperlink w:anchor="_Toc239595853" w:history="1">
             <w:r>
               <w:rPr>
                 <w:rStyle w:val="Hipervnculo"/>
@@ -5138,7 +5152,7 @@
                 <w:noProof/>
                 <w:webHidden/>
               </w:rPr>
-              <w:instrText xml:space="preserve"> PAGEREF _Toc239546189 \h </w:instrText>
+              <w:instrText xml:space="preserve"> PAGEREF _Toc239595853 \h </w:instrText>
             </w:r>
             <w:r>
               <w:rPr>
@@ -5158,7 +5172,7 @@
                 <w:noProof/>
                 <w:webHidden/>
               </w:rPr>
-              <w:t>31</w:t>
+              <w:t>37</w:t>
             </w:r>
             <w:r>
               <w:rPr>
@@ -5181,7 +5195,7 @@
               <w14:ligatures w14:val="standardContextual"/>
             </w:rPr>
           </w:pPr>
-          <w:hyperlink w:anchor="_Toc239546190" w:history="1">
+          <w:hyperlink w:anchor="_Toc239595854" w:history="1">
             <w:r>
               <w:rPr>
                 <w:rStyle w:val="Hipervnculo"/>
@@ -5208,7 +5222,7 @@
                 <w:noProof/>
                 <w:webHidden/>
               </w:rPr>
-              <w:instrText xml:space="preserve"> PAGEREF _Toc239546190 \h </w:instrText>
+              <w:instrText xml:space="preserve"> PAGEREF _Toc239595854 \h </w:instrText>
             </w:r>
             <w:r>
               <w:rPr>
@@ -5228,7 +5242,7 @@
                 <w:noProof/>
                 <w:webHidden/>
               </w:rPr>
-              <w:t>33</w:t>
+              <w:t>39</w:t>
             </w:r>
             <w:r>
               <w:rPr>
@@ -5251,7 +5265,7 @@
               <w14:ligatures w14:val="standardContextual"/>
             </w:rPr>
           </w:pPr>
-          <w:hyperlink w:anchor="_Toc239546191" w:history="1">
+          <w:hyperlink w:anchor="_Toc239595855" w:history="1">
             <w:r>
               <w:rPr>
                 <w:rStyle w:val="Hipervnculo"/>
@@ -5278,7 +5292,7 @@
                 <w:noProof/>
                 <w:webHidden/>
               </w:rPr>
-              <w:instrText xml:space="preserve"> PAGEREF _Toc239546191 \h </w:instrText>
+              <w:instrText xml:space="preserve"> PAGEREF _Toc239595855 \h </w:instrText>
             </w:r>
             <w:r>
               <w:rPr>
@@ -5298,7 +5312,7 @@
                 <w:noProof/>
                 <w:webHidden/>
               </w:rPr>
-              <w:t>35</w:t>
+              <w:t>41</w:t>
             </w:r>
             <w:r>
               <w:rPr>
@@ -5395,7 +5409,7 @@
             <w:noProof/>
           </w:rPr>
           <w:noBreakHyphen/>
-          <w:t>1. Ejemplo de figura</w:t>
+          <w:t>1. Cuadernillo original de una temporada</w:t>
         </w:r>
         <w:r>
           <w:rPr>
@@ -5436,7 +5450,7 @@
             <w:noProof/>
             <w:webHidden/>
           </w:rPr>
-          <w:t>6</w:t>
+          <w:t>—</w:t>
         </w:r>
         <w:r>
           <w:rPr>
@@ -5466,7 +5480,7 @@
             <w:rStyle w:val="Hipervnculo"/>
             <w:noProof/>
           </w:rPr>
-          <w:t>Figura 3</w:t>
+          <w:t>Figura 4</w:t>
         </w:r>
         <w:r>
           <w:rPr>
@@ -5474,7 +5488,7 @@
             <w:noProof/>
           </w:rPr>
           <w:noBreakHyphen/>
-          <w:t>2. Opciones para configurar la tabla de contenidos</w:t>
+          <w:t>1. Arquitectura de la aplicación (navegador – SQLPage – base de datos)</w:t>
         </w:r>
         <w:r>
           <w:rPr>
@@ -5515,7 +5529,7 @@
             <w:noProof/>
             <w:webHidden/>
           </w:rPr>
-          <w:t>8</w:t>
+          <w:t>—</w:t>
         </w:r>
         <w:r>
           <w:rPr>
@@ -5525,6 +5539,142 @@
           <w:fldChar w:fldCharType="end"/>
         </w:r>
       </w:hyperlink>
+    </w:p>
+    <w:p>
+      <w:pPr>
+        <w:pStyle w:val="Tabladeilustraciones"/>
+        <w:tabs>
+          <w:tab w:val="right" w:leader="dot" w:pos="9350"/>
+        </w:tabs>
+        <w:rPr>
+          <w:rFonts w:asciiTheme="minorHAnsi" w:eastAsiaTheme="minorEastAsia" w:hAnsiTheme="minorHAnsi" w:cstheme="minorBidi"/>
+          <w:noProof/>
+          <w:szCs w:val="22"/>
+          <w:lang w:val="es-ES" w:eastAsia="es-ES"/>
+        </w:rPr>
+      </w:pPr>
+      <w:r>
+        <w:t>Figura 4-2. Página de inicio</w:t>
+      </w:r>
+    </w:p>
+    <w:p>
+      <w:pPr>
+        <w:pStyle w:val="Tabladeilustraciones"/>
+        <w:tabs>
+          <w:tab w:val="right" w:leader="dot" w:pos="9350"/>
+        </w:tabs>
+        <w:rPr>
+          <w:rFonts w:asciiTheme="minorHAnsi" w:eastAsiaTheme="minorEastAsia" w:hAnsiTheme="minorHAnsi" w:cstheme="minorBidi"/>
+          <w:noProof/>
+          <w:szCs w:val="22"/>
+          <w:lang w:val="es-ES" w:eastAsia="es-ES"/>
+        </w:rPr>
+      </w:pPr>
+      <w:r>
+        <w:t>Figura 4-3. Clasificación de un año, deporte, género y categoría</w:t>
+      </w:r>
+    </w:p>
+    <w:p>
+      <w:pPr>
+        <w:pStyle w:val="Tabladeilustraciones"/>
+        <w:tabs>
+          <w:tab w:val="right" w:leader="dot" w:pos="9350"/>
+        </w:tabs>
+        <w:rPr>
+          <w:rFonts w:asciiTheme="minorHAnsi" w:eastAsiaTheme="minorEastAsia" w:hAnsiTheme="minorHAnsi" w:cstheme="minorBidi"/>
+          <w:noProof/>
+          <w:szCs w:val="22"/>
+          <w:lang w:val="es-ES" w:eastAsia="es-ES"/>
+        </w:rPr>
+      </w:pPr>
+      <w:r>
+        <w:t>Figura 4-4. Listado de todos los equipos</w:t>
+      </w:r>
+    </w:p>
+    <w:p>
+      <w:pPr>
+        <w:pStyle w:val="Tabladeilustraciones"/>
+        <w:tabs>
+          <w:tab w:val="right" w:leader="dot" w:pos="9350"/>
+        </w:tabs>
+        <w:rPr>
+          <w:rFonts w:asciiTheme="minorHAnsi" w:eastAsiaTheme="minorEastAsia" w:hAnsiTheme="minorHAnsi" w:cstheme="minorBidi"/>
+          <w:noProof/>
+          <w:szCs w:val="22"/>
+          <w:lang w:val="es-ES" w:eastAsia="es-ES"/>
+        </w:rPr>
+      </w:pPr>
+      <w:r>
+        <w:t>Figura 4-5. Histórico de un equipo</w:t>
+      </w:r>
+    </w:p>
+    <w:p>
+      <w:pPr>
+        <w:pStyle w:val="Tabladeilustraciones"/>
+        <w:tabs>
+          <w:tab w:val="right" w:leader="dot" w:pos="9350"/>
+        </w:tabs>
+        <w:rPr>
+          <w:rFonts w:asciiTheme="minorHAnsi" w:eastAsiaTheme="minorEastAsia" w:hAnsiTheme="minorHAnsi" w:cstheme="minorBidi"/>
+          <w:noProof/>
+          <w:szCs w:val="22"/>
+          <w:lang w:val="es-ES" w:eastAsia="es-ES"/>
+        </w:rPr>
+      </w:pPr>
+      <w:r>
+        <w:t>Figura 4-6. Listado de deportes</w:t>
+      </w:r>
+    </w:p>
+    <w:p>
+      <w:pPr>
+        <w:pStyle w:val="Tabladeilustraciones"/>
+        <w:tabs>
+          <w:tab w:val="right" w:leader="dot" w:pos="9350"/>
+        </w:tabs>
+        <w:rPr>
+          <w:rFonts w:asciiTheme="minorHAnsi" w:eastAsiaTheme="minorEastAsia" w:hAnsiTheme="minorHAnsi" w:cstheme="minorBidi"/>
+          <w:noProof/>
+          <w:szCs w:val="22"/>
+          <w:lang w:val="es-ES" w:eastAsia="es-ES"/>
+        </w:rPr>
+      </w:pPr>
+      <w:r>
+        <w:t>Figura 4-7. Histórico de un deporte</w:t>
+      </w:r>
+    </w:p>
+    <w:p>
+      <w:pPr>
+        <w:pStyle w:val="Tabladeilustraciones"/>
+        <w:tabs>
+          <w:tab w:val="right" w:leader="dot" w:pos="9350"/>
+        </w:tabs>
+        <w:rPr>
+          <w:rFonts w:asciiTheme="minorHAnsi" w:eastAsiaTheme="minorEastAsia" w:hAnsiTheme="minorHAnsi" w:cstheme="minorBidi"/>
+          <w:noProof/>
+          <w:szCs w:val="22"/>
+          <w:lang w:val="es-ES" w:eastAsia="es-ES"/>
+        </w:rPr>
+      </w:pPr>
+      <w:r>
+        <w:t>Figura 4-8. Explorador de estadísticas</w:t>
+      </w:r>
+    </w:p>
+    <w:p>
+      <w:pPr>
+        <w:pStyle w:val="Tabladeilustraciones"/>
+        <w:tabs>
+          <w:tab w:val="right" w:leader="dot" w:pos="9350"/>
+        </w:tabs>
+        <w:rPr>
+          <w:rFonts w:asciiTheme="minorHAnsi" w:eastAsiaTheme="minorEastAsia" w:hAnsiTheme="minorHAnsi" w:cstheme="minorBidi"/>
+          <w:noProof/>
+          <w:szCs w:val="22"/>
+          <w:lang w:val="es-ES" w:eastAsia="es-ES"/>
+        </w:rPr>
+      </w:pPr>
+      <w:r>
+        <w:t>Figura 5-1. Contenedores de datos y de aplicación sobre la red compartida</w:t>
+      </w:r>
     </w:p>
     <w:p>
       <w:pPr>
@@ -5609,7 +5759,7 @@
             <w:noProof/>
           </w:rPr>
           <w:noBreakHyphen/>
-          <w:t>1. Ejemplo de tabla</w:t>
+          <w:t>1. Ejemplos de normalización de nombres de equipo</w:t>
         </w:r>
         <w:r>
           <w:rPr>
@@ -5650,7 +5800,7 @@
             <w:noProof/>
             <w:webHidden/>
           </w:rPr>
-          <w:t>6</w:t>
+          <w:t>—</w:t>
         </w:r>
         <w:r>
           <w:rPr>
@@ -5689,7 +5839,7 @@
       <w:bookmarkStart w:id="3" w:name="_Ref11682300"/>
       <w:bookmarkStart w:id="4" w:name="_Ref11684759"/>
       <w:bookmarkStart w:id="5" w:name="_Toc116636436"/>
-      <w:bookmarkStart w:id="6" w:name="_Toc239546140"/>
+      <w:bookmarkStart w:id="6" w:name="_Toc239595804"/>
       <w:r>
         <w:lastRenderedPageBreak/>
         <w:t>Introducción</w:t>
@@ -5704,7 +5854,7 @@
         <w:pStyle w:val="Ttulo2"/>
       </w:pPr>
       <w:bookmarkStart w:id="7" w:name="_Toc116636437"/>
-      <w:bookmarkStart w:id="8" w:name="_Toc239546141"/>
+      <w:bookmarkStart w:id="8" w:name="_Toc239595805"/>
       <w:r>
         <w:t>M</w:t>
       </w:r>
@@ -5767,7 +5917,7 @@
         <w:pStyle w:val="Ttulo2"/>
       </w:pPr>
       <w:bookmarkStart w:id="9" w:name="_Toc116636438"/>
-      <w:bookmarkStart w:id="10" w:name="_Toc239546142"/>
+      <w:bookmarkStart w:id="10" w:name="_Toc239595806"/>
       <w:r>
         <w:t>Objetivos</w:t>
       </w:r>
@@ -5836,7 +5986,7 @@
         <w:pStyle w:val="Ttulo2"/>
       </w:pPr>
       <w:bookmarkStart w:id="11" w:name="_Toc116636439"/>
-      <w:bookmarkStart w:id="12" w:name="_Toc239546143"/>
+      <w:bookmarkStart w:id="12" w:name="_Toc239595807"/>
       <w:r>
         <w:t>Plan de trabajo</w:t>
       </w:r>
@@ -5869,7 +6019,7 @@
       <w:pPr>
         <w:pStyle w:val="Ttulo2"/>
       </w:pPr>
-      <w:bookmarkStart w:id="13" w:name="_Toc239546144"/>
+      <w:bookmarkStart w:id="13" w:name="_Toc239595808"/>
       <w:r>
         <w:t>Organización de la memoria</w:t>
       </w:r>
@@ -5902,7 +6052,7 @@
         </w:rPr>
       </w:pPr>
       <w:bookmarkStart w:id="14" w:name="_Toc116636440"/>
-      <w:bookmarkStart w:id="15" w:name="_Toc239546145"/>
+      <w:bookmarkStart w:id="15" w:name="_Toc239595809"/>
       <w:r>
         <w:rPr>
           <w:lang w:val="es-ES"/>
@@ -5930,7 +6080,7 @@
           <w:lang w:val="es-ES"/>
         </w:rPr>
       </w:pPr>
-      <w:bookmarkStart w:id="16" w:name="_Toc239546146"/>
+      <w:bookmarkStart w:id="16" w:name="_Toc239595810"/>
       <w:r>
         <w:t>Extracción automática de información de documentos escaneados</w:t>
       </w:r>
@@ -5953,7 +6103,7 @@
           <w:lang w:val="es-ES"/>
         </w:rPr>
       </w:pPr>
-      <w:bookmarkStart w:id="17" w:name="_Toc239546147"/>
+      <w:bookmarkStart w:id="17" w:name="_Toc239595811"/>
       <w:r>
         <w:t>Arquitecturas para aplicaciones web de consulta de datos</w:t>
       </w:r>
@@ -6002,7 +6152,7 @@
         </w:rPr>
       </w:pPr>
       <w:bookmarkStart w:id="18" w:name="_Toc116636441"/>
-      <w:bookmarkStart w:id="19" w:name="_Toc239546148"/>
+      <w:bookmarkStart w:id="19" w:name="_Toc239595812"/>
       <w:bookmarkEnd w:id="18"/>
       <w:r>
         <w:lastRenderedPageBreak/>
@@ -6027,7 +6177,7 @@
           <w:lang w:val="es-ES"/>
         </w:rPr>
       </w:pPr>
-      <w:bookmarkStart w:id="20" w:name="_Toc239546149"/>
+      <w:bookmarkStart w:id="20" w:name="_Toc239595813"/>
       <w:r>
         <w:t>Los cuadernillos de la Oficina de Deportes</w:t>
       </w:r>
@@ -6050,17 +6200,133 @@
         </w:rPr>
       </w:pPr>
       <w:r>
-        <w:t>No se dispone de cuadernillo, ni en papel ni en PDF, de los cursos 1999-00 a 2004-05: son años sin documentación localizada y, por tanto, fuera del alcance de este trabajo. Para el resto de temporadas, desde 1990-91 hasta 2023-24 salvo ese hueco, sí se ha localizado el documento fuente.</w:t>
-      </w:r>
-    </w:p>
-    <w:p>
-      <w:pPr>
+        <w:t>El formato de estos cuadernillos dista mucho de ser uniforme a lo largo de más de treinta años. Cambia la disposición de las tablas, el número de páginas por deporte, si un deporte se organiza por grupos con una fase final o directamente por liga, si existe una clasificación de ascenso independiente, y si el Trofeo Alfonso XIII se presenta en una sección propia o mezclado con las clasificaciones de liga. Además, el propio Trofeo Rector como clasificación general no existió como tal hasta la temporada 2005-06: en las temporadas anteriores cada deporte se resuelve de forma independiente. Estas diferencias se fueron documentando de forma sistemática a medida que se revisaba cada año, y resultaron determinantes tanto para descartar la extracción totalmente automática y sin supervisión como para diseñar el proceso de verificación asistida descrito más adelante en este capítulo.</w:t>
+      </w:r>
+    </w:p>
+    <w:p>
+      <w:pPr>
+        <w:pStyle w:val="Ttulo2"/>
         <w:rPr>
           <w:lang w:val="es-ES"/>
         </w:rPr>
       </w:pPr>
-      <w:r>
-        <w:t>El formato de estos cuadernillos dista mucho de ser uniforme a lo largo de más de treinta años. Cambia la disposición de las tablas, el número de páginas por deporte, si un deporte se organiza por grupos con una fase final o directamente por liga, si existe una clasificación de ascenso independiente, y si el Trofeo Alfonso XIII se presenta en una sección propia o mezclado con las clasificaciones de liga. Además, el propio Trofeo Rector como clasificación general no existió como tal hasta la temporada 2005-06: en las temporadas anteriores cada deporte se resuelve de forma independiente. Estas diferencias se fueron documentando de forma sistemática a medida que se revisaba cada año, y resultaron determinantes tanto para descartar la extracción totalmente automática y sin supervisión como para diseñar el proceso de verificación asistida descrito más adelante en este capítulo.</w:t>
+      <w:bookmarkStart w:id="21" w:name="_Toc239595814"/>
+      <w:r>
+        <w:t>Primeras aproximaciones a la digitalización automática</w:t>
+      </w:r>
+      <w:bookmarkEnd w:id="21"/>
+    </w:p>
+    <w:p>
+      <w:pPr>
+        <w:rPr>
+          <w:lang w:val="es-ES"/>
+        </w:rPr>
+      </w:pPr>
+      <w:r>
+        <w:t xml:space="preserve">Antes de decidir el enfoque definitivo, se exploraron varias vías para automatizar, total o parcialmente y sin intervención humana en cada caso concreto, la extracción de las clasificaciones a partir de los cuadernillos escaneados. Se describen a </w:t>
+      </w:r>
+      <w:r>
+        <w:lastRenderedPageBreak/>
+        <w:t>continuación por orden cronológico, junto con los motivos por los que cada una se fue descartando o quedándose corta.</w:t>
+      </w:r>
+    </w:p>
+    <w:p>
+      <w:pPr>
+        <w:pStyle w:val="Ttulo3"/>
+        <w:rPr>
+          <w:lang w:val="es-ES"/>
+        </w:rPr>
+      </w:pPr>
+      <w:bookmarkStart w:id="22" w:name="_Toc239595815"/>
+      <w:r>
+        <w:t>Extracción por reglas sobre texto plano</w:t>
+      </w:r>
+      <w:bookmarkEnd w:id="22"/>
+    </w:p>
+    <w:p>
+      <w:pPr>
+        <w:rPr>
+          <w:lang w:val="es-ES"/>
+        </w:rPr>
+      </w:pPr>
+      <w:r>
+        <w:t>La primera aproximación consistió en convertir cada página del cuadernillo a texto plano y analizarlo línea a línea con un conjunto de reglas: detectar la palabra «Categoría» para identificar el deporte y el género, «Clasificación» para marcar el inicio de una tabla de resultados, «Descalificado» para las bajas, etc. Este enfoque, implementado en varias iteraciones sucesivas a medida que se iban descubriendo nuevos casos no contemplados, resultó extremadamente frágil: cada deporte, cada año e incluso cada categoría dentro de un mismo deporte podían presentar el resultado con un formato de línea ligeramente distinto (columnas en otro orden, presencia o ausencia de una jornada de descalificación, tabuladores en vez de espacios), lo que obligaba a añadir una excepción nueva por cada caso encontrado sin llegar nunca a una cobertura fiable.</w:t>
+      </w:r>
+    </w:p>
+    <w:p>
+      <w:pPr>
+        <w:pStyle w:val="Ttulo3"/>
+        <w:rPr>
+          <w:lang w:val="es-ES"/>
+        </w:rPr>
+      </w:pPr>
+      <w:bookmarkStart w:id="23" w:name="_Toc239595816"/>
+      <w:r>
+        <w:t>Reconocimiento de documentos con Azure AI Document Intelligence</w:t>
+      </w:r>
+      <w:bookmarkEnd w:id="23"/>
+    </w:p>
+    <w:p>
+      <w:pPr>
+        <w:rPr>
+          <w:lang w:val="es-ES"/>
+        </w:rPr>
+      </w:pPr>
+      <w:r>
+        <w:t>La segunda aproximación sustituyó el análisis de texto plano por un servicio de reconocimiento de documentos en la nube, Azure AI Document Intelligence (denominado Azure Form Recognizer en el momento de realizar estas pruebas), capaz de identificar no solo el texto de cada página sino también su estructura en tablas. El PDF de cada año se dividía en documentos de dos páginas con la biblioteca pypdf, se enviaba cada uno al servicio, y el resultado (líneas de texto y tablas reconocidas) se procesaba con una lógica similar a la del enfoque anterior para generar las sentencias SQL de inserción correspondientes. Para facilitar las pruebas sobre distintos documentos se construyó además una pequeña interfaz gráfica en Tkinter que permitía seleccionar un PDF y lanzar el proceso completo. Este enfoque mejoró sensiblemente el reconocimiento de las tablas de clasificación, pero seguía dependiendo de la misma lógica basada en reglas para interpretar el contexto alrededor de cada tabla (deporte, género, categoría, si se trataba del Trofeo Alfonso), y por tanto heredaba buena parte de la fragilidad del enfoque anterior frente a los cambios de formato entre años.</w:t>
+      </w:r>
+    </w:p>
+    <w:p>
+      <w:pPr>
+        <w:pStyle w:val="Ttulo3"/>
+        <w:rPr>
+          <w:lang w:val="es-ES"/>
+        </w:rPr>
+      </w:pPr>
+      <w:bookmarkStart w:id="24" w:name="_Toc239595817"/>
+      <w:r>
+        <w:lastRenderedPageBreak/>
+        <w:t>Extracción asistida por modelos de lenguaje</w:t>
+      </w:r>
+      <w:bookmarkEnd w:id="24"/>
+    </w:p>
+    <w:p>
+      <w:pPr>
+        <w:rPr>
+          <w:lang w:val="es-ES"/>
+        </w:rPr>
+      </w:pPr>
+      <w:r>
+        <w:t>La tercera vía explorada consistió en delegar tanto el reconocimiento como la interpretación en un modelo de lenguaje multimodal, a través de la API de OpenAI: se enviaba directamente el PDF de un bloque de páginas junto con una serie de instrucciones pidiendo como respuesta un JSON con los registros reconocidos, para posteriormente convertir ese JSON en sentencias SQL. Este enfoque simplificaba mucho el código propio, al trasladar al modelo la tarea de interpretar el contexto de cada tabla, pero introducía un problema distinto: no hay garantía de que un modelo de lenguaje no complete o corrija silenciosamente un dato mal escaneado o parcialmente ilegible con un valor plausible pero incorrecto, lo cual es especialmente delicado al construir lo que se pretende que sea un histórico oficial de resultados deportivos.</w:t>
+      </w:r>
+    </w:p>
+    <w:p>
+      <w:pPr>
+        <w:pStyle w:val="Ttulo3"/>
+        <w:rPr>
+          <w:lang w:val="es-ES"/>
+        </w:rPr>
+      </w:pPr>
+      <w:bookmarkStart w:id="25" w:name="_Toc239595818"/>
+      <w:r>
+        <w:t>Por qué se descartó la extracción totalmente automática</w:t>
+      </w:r>
+      <w:bookmarkEnd w:id="25"/>
+    </w:p>
+    <w:p>
+      <w:pPr>
+        <w:rPr>
+          <w:lang w:val="es-ES"/>
+        </w:rPr>
+      </w:pPr>
+      <w:r>
+        <w:t>Ninguna de las tres aproximaciones anteriores llegó a ofrecer garantías suficientes de fidelidad frente al documento original en el conjunto completo de años y deportes. La causa de fondo es siempre la misma: más de treinta años de cuadernillos, elaborados por personas distintas en épocas distintas, no siguen un formato lo bastante regular como para que un proceso sin ningún tipo de supervisión humana generalice de un año a otro con garantías. Dado que el objetivo del trabajo era producir un histórico correcto</w:t>
+      </w:r>
+      <w:r>
+        <w:t xml:space="preserve">, </w:t>
+      </w:r>
+      <w:r>
+        <w:t>no simplemente plausible, lo que se descartó no fue el uso de herramientas de inteligencia artificial en sí, sino la idea de dejar que una de ellas propusiera la transcripción completa de un año sin que cada dato pasara después por una revisión humana contra el documento original. El apartado 3.4 describe el proceso que se siguió en su lugar, en el que sí se recurrió a un asistente de programación basado en inteligencia artificial, pero integrado en un flujo de trabajo dirigido y verificado en todo momento por el propio estudiante.</w:t>
       </w:r>
     </w:p>
     <w:p>
@@ -6070,12 +6336,35 @@
           <w:lang w:val="es-ES"/>
         </w:rPr>
       </w:pPr>
-      <w:bookmarkStart w:id="21" w:name="_Toc239546150"/>
+      <w:bookmarkStart w:id="26" w:name="_Toc116636444"/>
+      <w:bookmarkStart w:id="27" w:name="_Toc239595819"/>
+      <w:bookmarkEnd w:id="26"/>
+      <w:r>
+        <w:t>Diseño del modelo de datos</w:t>
+      </w:r>
+      <w:bookmarkEnd w:id="27"/>
+    </w:p>
+    <w:p>
+      <w:pPr>
+        <w:pStyle w:val="Textoindependiente"/>
+        <w:rPr>
+          <w:lang w:val="es-ES"/>
+        </w:rPr>
+      </w:pPr>
+      <w:r>
+        <w:t xml:space="preserve">Todas las clasificaciones, con independencia del año, el deporte, el género o la categoría, se representan con una única tabla, </w:t>
+      </w:r>
+    </w:p>
+    <w:p>
+      <w:pPr>
+        <w:rPr>
+          <w:lang w:val="es-ES"/>
+        </w:rPr>
+      </w:pPr>
       <w:r>
         <w:lastRenderedPageBreak/>
-        <w:t>Primeras aproximaciones a la digitalización automática</w:t>
-      </w:r>
-      <w:bookmarkEnd w:id="21"/>
+        <w:t>Clasificaciones, con una fila por cada equipo y clasificación en la que ha participado. Cada fila queda identificada por la combinación de año, deporte, equipo, género y categoría, que forma la clave primaria de la tabla, y contiene además el puesto obtenido, los puntos, si hubo ascenso o descenso, y la posición en el Trofeo Alfonso XIII si la hubiera. Los valores -1 se usan de forma consistente para representar una descalificación, tanto en el puesto de liga como en el del Trofeo Alfonso, mientras que los valores nulos indican que ese dato no aplica a la fila en cuestión (por ejemplo, un equipo que solo aparece en la clasificación del Trofeo Alfonso no tiene puesto de liga).</w:t>
+      </w:r>
     </w:p>
     <w:p>
       <w:pPr>
@@ -6084,21 +6373,21 @@
         </w:rPr>
       </w:pPr>
       <w:r>
-        <w:t>Antes de decidir el enfoque definitivo, se exploraron varias vías para automatizar, total o parcialmente y sin intervención humana en cada caso concreto, la extracción de las clasificaciones a partir de los cuadernillos escaneados. Se describen a continuación por orden cronológico, junto con los motivos por los que cada una se fue descartando o quedándose corta.</w:t>
-      </w:r>
-    </w:p>
-    <w:p>
-      <w:pPr>
-        <w:pStyle w:val="Ttulo3"/>
+        <w:t>Este diseño, deliberadamente sencillo, permite responder a cualquier consulta sobre el histórico —la clasificación de un año y deporte concretos, el historial completo de un equipo, el palmarés de un deporte, comparativas entre equipos— con una única tabla y sin necesidad de normalizar en varias tablas relacionadas información que, en la práctica, rara vez cambia de forma independiente.</w:t>
+      </w:r>
+    </w:p>
+    <w:p>
+      <w:pPr>
+        <w:pStyle w:val="Ttulo2"/>
         <w:rPr>
           <w:lang w:val="es-ES"/>
         </w:rPr>
       </w:pPr>
-      <w:bookmarkStart w:id="22" w:name="_Toc239546151"/>
-      <w:r>
-        <w:t>Extracción por reglas sobre texto plano</w:t>
-      </w:r>
-      <w:bookmarkEnd w:id="22"/>
+      <w:bookmarkStart w:id="28" w:name="_Toc239595820"/>
+      <w:r>
+        <w:t>Proceso de verificación de los datos</w:t>
+      </w:r>
+      <w:bookmarkEnd w:id="28"/>
     </w:p>
     <w:p>
       <w:pPr>
@@ -6107,21 +6396,52 @@
         </w:rPr>
       </w:pPr>
       <w:r>
-        <w:t>La primera aproximación consistió en convertir cada página del cuadernillo a texto plano y analizarlo línea a línea con un conjunto de reglas: detectar la palabra «Categoría» para identificar el deporte y el género, «Clasificación» para marcar el inicio de una tabla de resultados, «Descalificado» para las bajas, etc. Este enfoque, implementado en varias iteraciones sucesivas a medida que se iban descubriendo nuevos casos no contemplados, resultó extremadamente frágil: cada deporte, cada año e incluso cada categoría dentro de un mismo deporte podían presentar el resultado con un formato de línea ligeramente distinto (columnas en otro orden, presencia o ausencia de una jornada de descalificación, tabuladores en vez de espacios), lo que obligaba a añadir una excepción nueva por cada caso encontrado sin llegar nunca a una cobertura fiable.</w:t>
-      </w:r>
-    </w:p>
-    <w:p>
-      <w:pPr>
-        <w:pStyle w:val="Ttulo3"/>
+        <w:t>Descartada la idea de una extracción totalmente automática y sin supervisión, la transcripción de los 26 años se llevó a cabo con la asistencia de Claude Code, un asistente de programación de Anthropic basado en modelos de lenguaje, usado aquí como herramienta de trabajo y en ningún momento como sustituto de la revisión del propio estudiante: para cada año se le indicaba trabajar sobre el documento original</w:t>
+      </w:r>
+      <w:r>
+        <w:t xml:space="preserve">, </w:t>
+      </w:r>
+      <w:r>
+        <w:t>el PDF escaneado del cuadernillo correspondiente y redactar, deporte a deporte, las sentencias SQL de inserción de la clasificación siguiendo el contrato de datos descrito en el apartado anterior. A partir de ahí, cada fichero se sometió a una revisión sistemática, dirigida en todo momento por el estudiante, contrastando cada dato con el documento original antes de darlo por válido.</w:t>
+      </w:r>
+    </w:p>
+    <w:p>
+      <w:pPr>
         <w:rPr>
           <w:lang w:val="es-ES"/>
         </w:rPr>
       </w:pPr>
-      <w:bookmarkStart w:id="23" w:name="_Toc239546152"/>
-      <w:r>
-        <w:t>Reconocimiento de documentos con Azure AI Document Intelligence</w:t>
-      </w:r>
-      <w:bookmarkEnd w:id="23"/>
+      <w:r>
+        <w:t>Se eligió esta forma de trabajar, y no una transcripción manual completa sin ningún apoyo, porque permitía dedicar el esfuerzo del estudiante íntegramente a la parte que ninguna herramienta puede hacer por él</w:t>
+      </w:r>
+      <w:r>
+        <w:t xml:space="preserve">, </w:t>
+      </w:r>
+      <w:r>
+        <w:t>decidir si un dato transcrito corresponde realmente a lo que dice el documento original y resolver los casos ambiguos con criterio propio</w:t>
+      </w:r>
+      <w:r>
+        <w:t>,</w:t>
+      </w:r>
+      <w:r>
+        <w:t xml:space="preserve"> en lugar de a la mecánica de teclear cada fila. El asistente aceleraba la primera redacción de cada clasificación y la ejecución repetida de las </w:t>
+      </w:r>
+      <w:r>
+        <w:lastRenderedPageBreak/>
+        <w:t>comprobaciones descritas más abajo, pero ninguna fila se dio por buena sin que el estudiante la hubiera cotejado personalmente con el cuadernillo; cuando una transcripción no coincidía con el original, o cuando un caso resultaba ambiguo, la decisión final</w:t>
+      </w:r>
+      <w:r>
+        <w:t xml:space="preserve">, </w:t>
+      </w:r>
+      <w:r>
+        <w:t>incluida la de dejar constancia escrita de la duda cuando no podía resolverse con total certeza</w:t>
+      </w:r>
+      <w:r>
+        <w:t>,</w:t>
+      </w:r>
+      <w:r>
+        <w:t xml:space="preserve"> fue siempre del estudiante, nunca del asistente.</w:t>
+      </w:r>
     </w:p>
     <w:p>
       <w:pPr>
@@ -6130,220 +6450,40 @@
         </w:rPr>
       </w:pPr>
       <w:r>
-        <w:t xml:space="preserve">La segunda aproximación sustituyó el análisis de texto plano por un servicio de reconocimiento de documentos en la nube, Azure AI Document Intelligence (denominado Azure Form Recognizer en el momento de realizar estas pruebas), capaz de identificar no solo el texto de cada página sino también su estructura en tablas. El PDF de cada año se dividía en documentos de dos páginas con la biblioteca pypdf, se enviaba cada uno al servicio, y el resultado (líneas de texto y tablas reconocidas) se procesaba con una lógica similar a la del enfoque anterior para generar las sentencias SQL de inserción correspondientes. Para facilitar las pruebas sobre distintos documentos se construyó además una pequeña interfaz gráfica en Tkinter que permitía seleccionar un PDF y lanzar el proceso completo. Este enfoque mejoró sensiblemente el </w:t>
-      </w:r>
-      <w:r>
-        <w:lastRenderedPageBreak/>
-        <w:t>reconocimiento de las tablas de clasificación, pero seguía dependiendo de la misma lógica basada en reglas para interpretar el contexto alrededor de cada tabla (deporte, género, categoría, si se trataba del Trofeo Alfonso), y por tanto heredaba buena parte de la fragilidad del enfoque anterior frente a los cambios de formato entre años.</w:t>
-      </w:r>
-    </w:p>
-    <w:p>
-      <w:pPr>
-        <w:pStyle w:val="Ttulo3"/>
+        <w:t>Además de esa revisión página a página, se automatizaron dos comprobaciones objetivas para detectar deslices que una revisión visual pudiera pasar por alto: cada fichero, una vez aceptado, se cargaba en una base de datos SQLite para comprobar que no violara la clave primaria de la tabla (lo que habría delatado una fila duplicada o un dato de identificación mal transcrito) y que todos los valores estuvieran dentro de rango. Al cierre de la revisión, los 26 años con documento disponible cargan sin errores de sintaxis ni violaciones de clave primaria, con un total de 7.479 filas.</w:t>
+      </w:r>
+    </w:p>
+    <w:p>
+      <w:pPr>
         <w:rPr>
           <w:lang w:val="es-ES"/>
         </w:rPr>
       </w:pPr>
-      <w:bookmarkStart w:id="24" w:name="_Toc239546153"/>
-      <w:r>
-        <w:t>Extracción asistida por modelos de lenguaje</w:t>
-      </w:r>
-      <w:bookmarkEnd w:id="24"/>
-    </w:p>
-    <w:p>
-      <w:pPr>
+      <w:r>
+        <w:t>Todas las incidencias encontradas durante este proceso</w:t>
+      </w:r>
+      <w:r>
+        <w:t xml:space="preserve">, </w:t>
+      </w:r>
+      <w:r>
+        <w:t>desde erratas puntuales en el cuadernillo original hasta patrones de error sistemáticos que se repetían en varios años</w:t>
+      </w:r>
+      <w:r>
+        <w:t>,</w:t>
+      </w:r>
+      <w:r>
+        <w:t xml:space="preserve"> se documentaron por escrito a medida que se detectaban, junto con el criterio que el estudiante decidió aplicar para resolver cada una, de forma que cualquier decisión tomada durante la digitalización quedara trazada y fuera reproducible.</w:t>
+      </w:r>
+    </w:p>
+    <w:p>
+      <w:pPr>
+        <w:pStyle w:val="Ttulo2"/>
         <w:rPr>
           <w:lang w:val="es-ES"/>
         </w:rPr>
       </w:pPr>
-      <w:r>
-        <w:t>La tercera vía explorada consistió en delegar tanto el reconocimiento como la interpretación en un modelo de lenguaje multimodal, a través de la API de OpenAI: se enviaba directamente el PDF de un bloque de páginas junto con una serie de instrucciones pidiendo como respuesta un JSON con los registros reconocidos, para posteriormente convertir ese JSON en sentencias SQL. Este enfoque simplificaba mucho el código propio, al trasladar al modelo la tarea de interpretar el contexto de cada tabla, pero introducía un problema distinto: no hay garantía de que un modelo de lenguaje no complete o corrija silenciosamente un dato mal escaneado o parcialmente ilegible con un valor plausible pero incorrecto, lo cual es especialmente delicado al construir lo que se pretende que sea un histórico oficial de resultados deportivos.</w:t>
-      </w:r>
-    </w:p>
-    <w:p>
-      <w:pPr>
-        <w:pStyle w:val="Ttulo3"/>
-        <w:rPr>
-          <w:lang w:val="es-ES"/>
-        </w:rPr>
-      </w:pPr>
-      <w:bookmarkStart w:id="25" w:name="_Toc239546154"/>
-      <w:r>
-        <w:t>Por qué se descartó la extracción totalmente automática</w:t>
-      </w:r>
-      <w:bookmarkEnd w:id="25"/>
-    </w:p>
-    <w:p>
-      <w:pPr>
-        <w:rPr>
-          <w:lang w:val="es-ES"/>
-        </w:rPr>
-      </w:pPr>
-      <w:r>
-        <w:t>Ninguna de las tres aproximaciones anteriores llegó a ofrecer garantías suficientes de fidelidad frente al documento original en el conjunto completo de años y deportes. La causa de fondo es siempre la misma: más de treinta años de cuadernillos, elaborados por personas distintas en épocas distintas, no siguen un formato lo bastante regular como para que un proceso sin ningún tipo de supervisión humana generalice de un año a otro con garantías. Dado que el objetivo del trabajo era producir un histórico correcto</w:t>
-      </w:r>
-      <w:r>
-        <w:t xml:space="preserve">, </w:t>
-      </w:r>
-      <w:r>
-        <w:t>no simplemente plausible, lo que se descartó no fue el uso de herramientas de inteligencia artificial en sí, sino la idea de dejar que una de ellas propusiera la transcripción completa de un año sin que cada dato pasara después por una revisión humana contra el documento original. El apartado 3.4 describe el proceso que se siguió en su lugar, en el que sí se recurrió a un asistente de programación basado en inteligencia artificial, pero integrado en un flujo de trabajo dirigido y verificado en todo momento por el propio estudiante.</w:t>
-      </w:r>
-    </w:p>
-    <w:p>
-      <w:pPr>
-        <w:pStyle w:val="Ttulo2"/>
-        <w:rPr>
-          <w:lang w:val="es-ES"/>
-        </w:rPr>
-      </w:pPr>
-      <w:bookmarkStart w:id="26" w:name="_Toc116636444"/>
-      <w:bookmarkStart w:id="27" w:name="_Toc239546155"/>
-      <w:bookmarkEnd w:id="26"/>
-      <w:r>
-        <w:lastRenderedPageBreak/>
-        <w:t>Diseño del modelo de datos</w:t>
-      </w:r>
-      <w:bookmarkEnd w:id="27"/>
-    </w:p>
-    <w:p>
-      <w:pPr>
-        <w:pStyle w:val="Textoindependiente"/>
-        <w:rPr>
-          <w:lang w:val="es-ES"/>
-        </w:rPr>
-      </w:pPr>
-      <w:r>
-        <w:t xml:space="preserve">Todas las clasificaciones, con independencia del año, el deporte, el género o la categoría, se representan con una única tabla, </w:t>
-      </w:r>
-    </w:p>
-    <w:p>
-      <w:pPr>
-        <w:rPr>
-          <w:lang w:val="es-ES"/>
-        </w:rPr>
-      </w:pPr>
-      <w:r>
-        <w:t>Clasificaciones, con una fila por cada equipo y clasificación en la que ha participado. Cada fila queda identificada por la combinación de año, deporte, equipo, género y categoría, que forma la clave primaria de la tabla, y contiene además el puesto obtenido, los puntos, si hubo ascenso o descenso, y la posición en el Trofeo Alfonso XIII si la hubiera. Los valores -1 se usan de forma consistente para representar una descalificación, tanto en el puesto de liga como en el del Trofeo Alfonso, mientras que los valores nulos indican que ese dato no aplica a la fila en cuestión (por ejemplo, un equipo que solo aparece en la clasificación del Trofeo Alfonso no tiene puesto de liga).</w:t>
-      </w:r>
-    </w:p>
-    <w:p>
-      <w:pPr>
-        <w:rPr>
-          <w:lang w:val="es-ES"/>
-        </w:rPr>
-      </w:pPr>
-      <w:r>
-        <w:t>Este diseño, deliberadamente sencillo, permite responder a cualquier consulta sobre el histórico —la clasificación de un año y deporte concretos, el historial completo de un equipo, el palmarés de un deporte, comparativas entre equipos— con una única tabla y sin necesidad de normalizar en varias tablas relacionadas información que, en la práctica, rara vez cambia de forma independiente.</w:t>
-      </w:r>
-    </w:p>
-    <w:p>
-      <w:pPr>
-        <w:pStyle w:val="Ttulo2"/>
-        <w:rPr>
-          <w:lang w:val="es-ES"/>
-        </w:rPr>
-      </w:pPr>
-      <w:bookmarkStart w:id="28" w:name="_Toc239546156"/>
-      <w:r>
-        <w:t>Proceso de verificación de los datos</w:t>
-      </w:r>
-      <w:bookmarkEnd w:id="28"/>
-    </w:p>
-    <w:p>
-      <w:pPr>
-        <w:rPr>
-          <w:lang w:val="es-ES"/>
-        </w:rPr>
-      </w:pPr>
-      <w:r>
-        <w:t>Descartada la idea de una extracción totalmente automática y sin supervisión, la transcripción de los 26 años se llevó a cabo con la asistencia de Claude Code, un asistente de programación de Anthropic basado en modelos de lenguaje, usado aquí como herramienta de trabajo y en ningún momento como sustituto de la revisión del propio estudiante: para cada año se le indicaba trabajar sobre el documento original</w:t>
-      </w:r>
-      <w:r>
-        <w:t xml:space="preserve">, </w:t>
-      </w:r>
-      <w:r>
-        <w:t>el PDF escaneado del cuadernillo correspondiente y redactar, deporte a deporte, las sentencias SQL de inserción de la clasificación siguiendo el contrato de datos descrito en el apartado anterior. A partir de ahí, cada fichero se sometió a una revisión sistemática, dirigida en todo momento por el estudiante, contrastando cada dato con el documento original antes de darlo por válido.</w:t>
-      </w:r>
-    </w:p>
-    <w:p>
-      <w:pPr>
-        <w:rPr>
-          <w:lang w:val="es-ES"/>
-        </w:rPr>
-      </w:pPr>
-      <w:r>
-        <w:t xml:space="preserve">Se eligió esta forma de trabajar, y no una transcripción manual completa sin ningún apoyo, porque permitía dedicar el esfuerzo del estudiante íntegramente a la </w:t>
-      </w:r>
-      <w:r>
-        <w:lastRenderedPageBreak/>
-        <w:t>parte que ninguna herramienta puede hacer por él</w:t>
-      </w:r>
-      <w:r>
-        <w:t xml:space="preserve">, </w:t>
-      </w:r>
-      <w:r>
-        <w:t>decidir si un dato transcrito corresponde realmente a lo que dice el documento original y resolver los casos ambiguos con criterio propio</w:t>
-      </w:r>
-      <w:r>
-        <w:t>,</w:t>
-      </w:r>
-      <w:r>
-        <w:t xml:space="preserve"> en lugar de a la mecánica de teclear cada fila. El asistente aceleraba la primera redacción de cada clasificación y la ejecución repetida de las comprobaciones descritas más abajo, pero ninguna fila se dio por buena sin que el estudiante la hubiera cotejado personalmente con el cuadernillo; cuando una transcripción no coincidía con el original, o cuando un caso resultaba ambiguo, la decisión final</w:t>
-      </w:r>
-      <w:r>
-        <w:t xml:space="preserve">, </w:t>
-      </w:r>
-      <w:r>
-        <w:t>incluida la de dejar constancia escrita de la duda cuando no podía resolverse con total certeza</w:t>
-      </w:r>
-      <w:r>
-        <w:t>,</w:t>
-      </w:r>
-      <w:r>
-        <w:t xml:space="preserve"> fue siempre del estudiante, nunca del asistente.</w:t>
-      </w:r>
-    </w:p>
-    <w:p>
-      <w:pPr>
-        <w:rPr>
-          <w:lang w:val="es-ES"/>
-        </w:rPr>
-      </w:pPr>
-      <w:r>
-        <w:t>Además de esa revisión página a página, se automatizaron dos comprobaciones objetivas para detectar deslices que una revisión visual pudiera pasar por alto: cada fichero, una vez aceptado, se cargaba en una base de datos SQLite para comprobar que no violara la clave primaria de la tabla (lo que habría delatado una fila duplicada o un dato de identificación mal transcrito) y que todos los valores estuvieran dentro de rango. Al cierre de la revisión, los 26 años con documento disponible cargan sin errores de sintaxis ni violaciones de clave primaria, con un total de 7.479 filas.</w:t>
-      </w:r>
-    </w:p>
-    <w:p>
-      <w:pPr>
-        <w:rPr>
-          <w:lang w:val="es-ES"/>
-        </w:rPr>
-      </w:pPr>
-      <w:r>
-        <w:t>Todas las incidencias encontradas durante este proceso</w:t>
-      </w:r>
-      <w:r>
-        <w:t xml:space="preserve">, </w:t>
-      </w:r>
-      <w:r>
-        <w:t>desde erratas puntuales en el cuadernillo original hasta patrones de error sistemáticos que se repetían en varios años</w:t>
-      </w:r>
-      <w:r>
-        <w:t>,</w:t>
-      </w:r>
-      <w:r>
-        <w:t xml:space="preserve"> se documentaron por escrito a medida que se detectaban, junto con el criterio que el estudiante decidió aplicar para resolver cada una, de forma que cualquier decisión tomada durante la digitalización quedara trazada y fuera reproducible.</w:t>
-      </w:r>
-    </w:p>
-    <w:p>
-      <w:pPr>
-        <w:pStyle w:val="Ttulo2"/>
-        <w:rPr>
-          <w:lang w:val="es-ES"/>
-        </w:rPr>
-      </w:pPr>
       <w:bookmarkStart w:id="29" w:name="_Toc116636445"/>
-      <w:bookmarkStart w:id="30" w:name="_Toc239546157"/>
+      <w:bookmarkStart w:id="30" w:name="_Toc239595821"/>
       <w:bookmarkEnd w:id="29"/>
       <w:r>
         <w:t>Normalización de nomenclatura</w:t>
@@ -6368,23 +6508,11 @@
         </w:rPr>
       </w:pPr>
       <w:r>
-        <w:t xml:space="preserve">Antes de fusionar dos nombres candidatos a ser el mismo equipo, se comprobó contra los propios datos que nunca coincidieran como entradas distintas dentro de una </w:t>
+        <w:t xml:space="preserve">Antes de fusionar dos nombres candidatos a ser el mismo equipo, se comprobó contra los propios datos que nunca coincidieran como entradas distintas dentro de una misma clasificación (mismo año, deporte, género y categoría): si coincidían, se trataba en realidad de dos equipos distintos con nombres parecidos, y se dejaban sin fusionar. Este criterio, aplicado de forma sistemática, permitió reducir alrededor de 180 formas distintas de escribir un nombre de equipo a 110 equipos reales, y unificar bajo un único </w:t>
       </w:r>
       <w:r>
         <w:lastRenderedPageBreak/>
-        <w:t>misma clasificación (mismo año, deporte, género y categoría): si coincidían, se trataba en realidad de dos equipos distintos con nombres parecidos, y se dejaban sin fusionar. Este criterio, aplicado de forma sistemática, permitió reducir alrededor de 180 formas distintas de escribir un nombre de equipo a 110 equipos reales, y unificar bajo un único nombre varios deportes que en unos años se registraban con una palabra y en otros con el número de jugadores (por ejemplo, fútbol registrado unas veces como «Fútbol» y otras como «Fútbol 11»). Este análisis, de nuevo con la ayuda de Claude Code para cruzar de forma sistemática cada pareja de nombres candidata contra los más de 7.000 registros, se revisó caso por caso: los cruces sin ambigüedad se unificaron directamente, y los que quedaban abiertos a interpretación —por ejemplo, si dos nombres muy parecidos correspondían de verdad al mismo equipo o a dos equipos distintos— se plantearon explícitamente al estudiante, que fue quien decidió en cada caso el nombre final o si debían mantenerse separados.</w:t>
-      </w:r>
-    </w:p>
-    <w:p>
-      <w:pPr>
-        <w:pStyle w:val="PieFigura"/>
-        <w:keepNext/>
-      </w:pPr>
-      <w:r>
-        <w:rPr>
-          <w:i/>
-        </w:rPr>
-        <w:t>[INSERTAR CAPTURA: fotografía de uno de los cuadernillos originales en papel, o de una página representativa del PDF escaneado de un año antiguo]</w:t>
+        <w:t>nombre varios deportes que en unos años se registraban con una palabra y en otros con el número de jugadores (por ejemplo, fútbol registrado unas veces como «Fútbol» y otras como «Fútbol 11»). Este análisis, de nuevo con la ayuda de Claude Code para cruzar de forma sistemática cada pareja de nombres candidata contra los más de 7.000 registros, se revisó caso por caso: los cruces sin ambigüedad se unificaron directamente, y los que quedaban abiertos a interpretación —por ejemplo, si dos nombres muy parecidos correspondían de verdad al mismo equipo o a dos equipos distintos— se plantearon explícitamente al estudiante, que fue quien decidió en cada caso el nombre final o si debían mantenerse separados.</w:t>
       </w:r>
     </w:p>
     <w:p>
@@ -6395,6 +6523,50 @@
       <w:bookmarkStart w:id="32" w:name="_Toc116637587"/>
       <w:bookmarkEnd w:id="31"/>
       <w:bookmarkEnd w:id="32"/>
+      <w:r>
+        <w:rPr>
+          <w:iCs w:val="0"/>
+          <w:noProof/>
+          <w:szCs w:val="24"/>
+          <w:lang w:val="es-ES" w:eastAsia="es-ES"/>
+        </w:rPr>
+        <w:lastRenderedPageBreak/>
+        <w:drawing>
+          <wp:inline distT="0" distB="0" distL="0" distR="0" wp14:anchorId="12B64592" wp14:editId="628F5A8F">
+            <wp:extent cx="5943600" cy="7169785"/>
+            <wp:effectExtent l="0" t="0" r="0" b="0"/>
+            <wp:docPr id="941447409" name="Imagen 1"/>
+            <wp:cNvGraphicFramePr>
+              <a:graphicFrameLocks xmlns:a="http://schemas.openxmlformats.org/drawingml/2006/main" noChangeAspect="1"/>
+            </wp:cNvGraphicFramePr>
+            <a:graphic xmlns:a="http://schemas.openxmlformats.org/drawingml/2006/main">
+              <a:graphicData uri="http://schemas.openxmlformats.org/drawingml/2006/picture">
+                <pic:pic xmlns:pic="http://schemas.openxmlformats.org/drawingml/2006/picture">
+                  <pic:nvPicPr>
+                    <pic:cNvPr id="941447409" name=""/>
+                    <pic:cNvPicPr/>
+                  </pic:nvPicPr>
+                  <pic:blipFill>
+                    <a:blip r:embed="rId13"/>
+                    <a:stretch>
+                      <a:fillRect/>
+                    </a:stretch>
+                  </pic:blipFill>
+                  <pic:spPr>
+                    <a:xfrm>
+                      <a:off x="0" y="0"/>
+                      <a:ext cx="5943600" cy="7169785"/>
+                    </a:xfrm>
+                    <a:prstGeom prst="rect">
+                      <a:avLst/>
+                    </a:prstGeom>
+                  </pic:spPr>
+                </pic:pic>
+              </a:graphicData>
+            </a:graphic>
+          </wp:inline>
+        </w:drawing>
+      </w:r>
       <w:r>
         <w:t>Figura 3-1. Cuadernillo original de una temporada</w:t>
       </w:r>
@@ -6424,30 +6596,32 @@
         <w:tblLook w:val="0000" w:firstRow="0" w:lastRow="0" w:firstColumn="0" w:lastColumn="0" w:noHBand="0" w:noVBand="0"/>
       </w:tblPr>
       <w:tblGrid>
-        <w:gridCol w:w="1690"/>
-        <w:gridCol w:w="1650"/>
-        <w:gridCol w:w="1534"/>
+        <w:gridCol w:w="2693"/>
+        <w:gridCol w:w="2629"/>
+        <w:gridCol w:w="2445"/>
       </w:tblGrid>
       <w:tr>
         <w:trPr>
+          <w:trHeight w:val="572"/>
           <w:jc w:val="center"/>
         </w:trPr>
         <w:tc>
           <w:tcPr>
-            <w:tcW w:w="1483" w:type="dxa"/>
+            <w:tcW w:w="2693" w:type="dxa"/>
           </w:tcPr>
           <w:p>
             <w:pPr>
               <w:pStyle w:val="Textotabla"/>
             </w:pPr>
             <w:r>
+              <w:lastRenderedPageBreak/>
               <w:t>Forma(s) originales</w:t>
             </w:r>
           </w:p>
         </w:tc>
         <w:tc>
           <w:tcPr>
-            <w:tcW w:w="1350" w:type="dxa"/>
+            <w:tcW w:w="2629" w:type="dxa"/>
           </w:tcPr>
           <w:p>
             <w:pPr>
@@ -6460,7 +6634,7 @@
         </w:tc>
         <w:tc>
           <w:tcPr>
-            <w:tcW w:w="1337" w:type="dxa"/>
+            <w:tcW w:w="2445" w:type="dxa"/>
           </w:tcPr>
           <w:p>
             <w:pPr>
@@ -6474,15 +6648,18 @@
       </w:tr>
       <w:tr>
         <w:trPr>
+          <w:trHeight w:val="1436"/>
           <w:jc w:val="center"/>
         </w:trPr>
         <w:tc>
           <w:tcPr>
-            <w:tcW w:w="1483" w:type="dxa"/>
+            <w:tcW w:w="2693" w:type="dxa"/>
           </w:tcPr>
           <w:p>
             <w:pPr>
               <w:pStyle w:val="Textotabla"/>
+              <w:ind w:firstLine="0"/>
+              <w:jc w:val="left"/>
               <w:rPr>
                 <w:lang w:val="en-US"/>
               </w:rPr>
@@ -6491,17 +6668,19 @@
               <w:rPr>
                 <w:lang w:val="en-US"/>
               </w:rPr>
-              <w:t>CMU BARBERAN / C.M. BARBERAN / Barberan</w:t>
+              <w:t>CMU BARBERAN /C.M. BARBERAN / Barberan</w:t>
             </w:r>
           </w:p>
         </w:tc>
         <w:tc>
           <w:tcPr>
-            <w:tcW w:w="1350" w:type="dxa"/>
+            <w:tcW w:w="2629" w:type="dxa"/>
           </w:tcPr>
           <w:p>
             <w:pPr>
               <w:pStyle w:val="Textotabla"/>
+              <w:ind w:firstLine="0"/>
+              <w:jc w:val="left"/>
             </w:pPr>
             <w:r>
               <w:t>C.M. BARBERAN</w:t>
@@ -6510,11 +6689,13 @@
         </w:tc>
         <w:tc>
           <w:tcPr>
-            <w:tcW w:w="1337" w:type="dxa"/>
+            <w:tcW w:w="2445" w:type="dxa"/>
           </w:tcPr>
           <w:p>
             <w:pPr>
               <w:pStyle w:val="Textotabla"/>
+              <w:ind w:firstLine="0"/>
+              <w:jc w:val="left"/>
             </w:pPr>
             <w:r>
               <w:t>Mismo colegio mayor con distinta abreviatura y distintas mayúsculas</w:t>
@@ -6524,15 +6705,18 @@
       </w:tr>
       <w:tr>
         <w:trPr>
+          <w:trHeight w:val="1220"/>
           <w:jc w:val="center"/>
         </w:trPr>
         <w:tc>
           <w:tcPr>
-            <w:tcW w:w="1483" w:type="dxa"/>
+            <w:tcW w:w="2693" w:type="dxa"/>
           </w:tcPr>
           <w:p>
             <w:pPr>
               <w:pStyle w:val="Textotabla"/>
+              <w:ind w:firstLine="0"/>
+              <w:jc w:val="left"/>
             </w:pPr>
             <w:r>
               <w:t>Fútbol</w:t>
@@ -6541,11 +6725,13 @@
         </w:tc>
         <w:tc>
           <w:tcPr>
-            <w:tcW w:w="1350" w:type="dxa"/>
+            <w:tcW w:w="2629" w:type="dxa"/>
           </w:tcPr>
           <w:p>
             <w:pPr>
               <w:pStyle w:val="Textotabla"/>
+              <w:ind w:firstLine="0"/>
+              <w:jc w:val="left"/>
             </w:pPr>
             <w:r>
               <w:t>Fútbol 11</w:t>
@@ -6554,11 +6740,13 @@
         </w:tc>
         <w:tc>
           <w:tcPr>
-            <w:tcW w:w="1337" w:type="dxa"/>
+            <w:tcW w:w="2445" w:type="dxa"/>
           </w:tcPr>
           <w:p>
             <w:pPr>
               <w:pStyle w:val="Textotabla"/>
+              <w:ind w:firstLine="0"/>
+              <w:jc w:val="left"/>
             </w:pPr>
             <w:r>
               <w:t>Mismo deporte, distinto nombre según el año</w:t>
@@ -6568,29 +6756,33 @@
       </w:tr>
       <w:tr>
         <w:trPr>
+          <w:trHeight w:val="1209"/>
           <w:jc w:val="center"/>
         </w:trPr>
         <w:tc>
           <w:tcPr>
-            <w:tcW w:w="1483" w:type="dxa"/>
+            <w:tcW w:w="2693" w:type="dxa"/>
           </w:tcPr>
           <w:p>
             <w:pPr>
               <w:pStyle w:val="Textotabla"/>
+              <w:ind w:firstLine="0"/>
+              <w:jc w:val="left"/>
             </w:pPr>
             <w:r>
-              <w:lastRenderedPageBreak/>
               <w:t>Fútbol Siete</w:t>
             </w:r>
           </w:p>
         </w:tc>
         <w:tc>
           <w:tcPr>
-            <w:tcW w:w="1350" w:type="dxa"/>
+            <w:tcW w:w="2629" w:type="dxa"/>
           </w:tcPr>
           <w:p>
             <w:pPr>
               <w:pStyle w:val="Textotabla"/>
+              <w:ind w:firstLine="0"/>
+              <w:jc w:val="left"/>
             </w:pPr>
             <w:r>
               <w:t>Fútbol 7</w:t>
@@ -6599,11 +6791,13 @@
         </w:tc>
         <w:tc>
           <w:tcPr>
-            <w:tcW w:w="1337" w:type="dxa"/>
+            <w:tcW w:w="2445" w:type="dxa"/>
           </w:tcPr>
           <w:p>
             <w:pPr>
               <w:pStyle w:val="Textotabla"/>
+              <w:ind w:firstLine="0"/>
+              <w:jc w:val="left"/>
             </w:pPr>
             <w:r>
               <w:t>Mismo deporte, unificado bajo la forma numérica</w:t>
@@ -6656,7 +6850,7 @@
           <w:lang w:val="es-ES"/>
         </w:rPr>
       </w:pPr>
-      <w:bookmarkStart w:id="35" w:name="_Toc239546158"/>
+      <w:bookmarkStart w:id="35" w:name="_Toc239595822"/>
       <w:r>
         <w:t>Diseño e implementación de la aplicación web</w:t>
       </w:r>
@@ -6679,8 +6873,9 @@
           <w:lang w:val="es-ES"/>
         </w:rPr>
       </w:pPr>
-      <w:bookmarkStart w:id="36" w:name="_Toc239546159"/>
-      <w:r>
+      <w:bookmarkStart w:id="36" w:name="_Toc239595823"/>
+      <w:r>
+        <w:lastRenderedPageBreak/>
         <w:t>Requisitos y restricciones de diseño</w:t>
       </w:r>
       <w:bookmarkEnd w:id="36"/>
@@ -6714,33 +6909,124 @@
         </w:rPr>
       </w:pPr>
       <w:r>
-        <w:t xml:space="preserve">No depender de ningún dato concreto escrito en el código: ningún año, deporte, equipo o categoría debía aparecer escrito a mano en ninguna página. Todas las opciones de los filtros y todas las cifras debían obtenerse en tiempo real a partir de </w:t>
+        <w:t>No depender de ningún dato concreto escrito en el código: ningún año, deporte, equipo o categoría debía aparecer escrito a mano en ninguna página. Todas las opciones de los filtros y todas las cifras debían obtenerse en tiempo real a partir de la base de datos, de forma que la misma aplicación sirviera para el dataset actual y para cualquier otro que respete el mismo contrato de datos.</w:t>
+      </w:r>
+    </w:p>
+    <w:p>
+      <w:pPr>
+        <w:pStyle w:val="Listaconvietas"/>
+        <w:rPr>
+          <w:lang w:val="es-ES"/>
+        </w:rPr>
+      </w:pPr>
+      <w:r>
+        <w:t>Minimizar las piezas móviles: evitar un backend a medida, una API propia y un framework de frontend independiente si no aportan nada que no resuelva ya el propio motor de base de datos.</w:t>
+      </w:r>
+    </w:p>
+    <w:p>
+      <w:pPr>
+        <w:pStyle w:val="Listaconvietas"/>
+        <w:rPr>
+          <w:lang w:val="es-ES"/>
+        </w:rPr>
+      </w:pPr>
+      <w:r>
+        <w:t>Ser desplegable con Docker de forma reproducible, separando el ciclo de vida de los datos del de la aplicación.</w:t>
+      </w:r>
+    </w:p>
+    <w:p>
+      <w:pPr>
+        <w:pStyle w:val="Ttulo2"/>
+        <w:rPr>
+          <w:lang w:val="es-ES"/>
+        </w:rPr>
+      </w:pPr>
+      <w:bookmarkStart w:id="37" w:name="_Toc239595824"/>
+      <w:r>
+        <w:t>Arquitectura: SQLPage sin backend intermedio</w:t>
+      </w:r>
+      <w:bookmarkEnd w:id="37"/>
+    </w:p>
+    <w:p>
+      <w:pPr>
+        <w:rPr>
+          <w:lang w:val="es-ES"/>
+        </w:rPr>
+      </w:pPr>
+      <w:r>
+        <w:t>Para cumplir estas restricciones se eligió SQLPage, una herramienta de código abierto que permite construir aplicaciones web completas escribiendo únicamente consultas SQL. Cada página de la aplicación es un fichero .sql que SQLPage ejecuta contra la base de datos; el resultado de cada consulta se interpreta como un componente visual (una tabla, un formulario, una tarjeta con una cifra</w:t>
+      </w:r>
+      <w:r>
+        <w:t>…</w:t>
+      </w:r>
+      <w:r>
+        <w:t xml:space="preserve">) que </w:t>
+      </w:r>
+      <w:proofErr w:type="spellStart"/>
+      <w:r>
+        <w:t>SQLPage</w:t>
+      </w:r>
+      <w:proofErr w:type="spellEnd"/>
+      <w:r>
+        <w:t xml:space="preserve"> renderiza como HTML, sin que el desarrollador tenga que escribir plantillas ni JavaScript. La arquitectura resultante es tan simple como se muestra en la Figura 4-1: el navegador habla directamente con SQLPage, y SQLPage con la base de datos, sin ningún backend propio ni API REST intermedia.</w:t>
+      </w:r>
+    </w:p>
+    <w:p>
+      <w:pPr>
+        <w:pStyle w:val="Descripcin"/>
+        <w:rPr>
+          <w:lang w:val="es-ES"/>
+        </w:rPr>
+      </w:pPr>
+      <w:r>
+        <w:t>Figura 4-1. Arquitectura de la aplicación (navegador – SQLPage – base de datos)</w:t>
+      </w:r>
+    </w:p>
+    <w:p>
+      <w:pPr>
+        <w:rPr>
+          <w:lang w:val="es-ES"/>
+        </w:rPr>
+      </w:pPr>
+      <w:r>
+        <w:t xml:space="preserve">Se valoraron alternativas más convencionales —un backend en Flask o Django con una API propia y un frontend independiente— pero se descartaron por resultar desproporcionadas para una aplicación cuyo único cometido es consultar datos ya existentes: habrían añadido un lenguaje, un framework y una capa de API completos </w:t>
       </w:r>
       <w:r>
         <w:lastRenderedPageBreak/>
-        <w:t>la base de datos, de forma que la misma aplicación sirviera para el dataset actual y para cualquier otro que respete el mismo contrato de datos.</w:t>
-      </w:r>
-    </w:p>
-    <w:p>
-      <w:pPr>
-        <w:pStyle w:val="Listaconvietas"/>
+        <w:t>únicamente para trasladar filas de una tabla a una página HTML, sin ningún beneficio adicional dado que no hay lógica de negocio ni operaciones de escritura que justifiquen esa complejidad.</w:t>
+      </w:r>
+    </w:p>
+    <w:p>
+      <w:pPr>
         <w:rPr>
           <w:lang w:val="es-ES"/>
         </w:rPr>
       </w:pPr>
       <w:r>
-        <w:t>Minimizar las piezas móviles: evitar un backend a medida, una API propia y un framework de frontend independiente si no aportan nada que no resuelva ya el propio motor de base de datos.</w:t>
-      </w:r>
-    </w:p>
-    <w:p>
-      <w:pPr>
-        <w:pStyle w:val="Listaconvietas"/>
+        <w:t>Todas las páginas comparten una cabecera y un menú comunes, definidos en un único fichero de configuración (shell.json) que SQLPage aplica a cada página, de forma que cambiar el título, el menú o el pie de página de toda la aplicación no requiere tocar cada fichero por separado.</w:t>
+      </w:r>
+    </w:p>
+    <w:p>
+      <w:pPr>
+        <w:pStyle w:val="Ttulo2"/>
         <w:rPr>
           <w:lang w:val="es-ES"/>
         </w:rPr>
       </w:pPr>
-      <w:r>
-        <w:t>Ser desplegable con Docker de forma reproducible, separando el ciclo de vida de los datos del de la aplicación.</w:t>
+      <w:bookmarkStart w:id="38" w:name="_Toc239595825"/>
+      <w:r>
+        <w:t>El contrato de datos</w:t>
+      </w:r>
+      <w:bookmarkEnd w:id="38"/>
+    </w:p>
+    <w:p>
+      <w:pPr>
+        <w:rPr>
+          <w:lang w:val="es-ES"/>
+        </w:rPr>
+      </w:pPr>
+      <w:r>
+        <w:t>La aplicación no asume nada sobre el contenido de la base de datos: se limita a exigir que exista una tabla Clasificaciones con las columnas descritas en el apartado 3.3, documentadas en un fichero schema.sql que actúa como contrato entre los datos y la aplicación. Cualquier base de datos MySQL o MariaDB que exponga esa misma tabla puede conectarse a la aplicación sin modificar ni una línea de las páginas: ni el número de deportes, ni los equipos, ni el rango de años están fijados en ningún sitio del código, sino que se obtienen siempre mediante consultas DISTINCT o agregaciones sobre la tabla en el momento de renderizar cada página. Esto permite, en principio, reutilizar la misma aplicación para digitalizar el histórico de otra competición universitaria distinta sin más que cargar sus datos con ese mismo formato.</w:t>
       </w:r>
     </w:p>
     <w:p>
@@ -6750,11 +7036,11 @@
           <w:lang w:val="es-ES"/>
         </w:rPr>
       </w:pPr>
-      <w:bookmarkStart w:id="37" w:name="_Toc239546160"/>
-      <w:r>
-        <w:t>Arquitectura: SQLPage sin backend intermedio</w:t>
-      </w:r>
-      <w:bookmarkEnd w:id="37"/>
+      <w:bookmarkStart w:id="39" w:name="_Toc239595826"/>
+      <w:r>
+        <w:t>Páginas y funcionalidades</w:t>
+      </w:r>
+      <w:bookmarkEnd w:id="39"/>
     </w:p>
     <w:p>
       <w:pPr>
@@ -6763,21 +7049,42 @@
         </w:rPr>
       </w:pPr>
       <w:r>
-        <w:t>Para cumplir estas restricciones se eligió SQLPage, una herramienta de código abierto que permite construir aplicaciones web completas escribiendo únicamente consultas SQL. Cada página de la aplicación es un fichero .sql que SQLPage ejecuta contra la base de datos; el resultado de cada consulta se interpreta como un componente visual (una tabla, un formulario, una tarjeta con una cifra</w:t>
-      </w:r>
-      <w:r>
-        <w:t>…</w:t>
-      </w:r>
-      <w:r>
-        <w:t xml:space="preserve">) que </w:t>
-      </w:r>
-      <w:proofErr w:type="spellStart"/>
-      <w:r>
-        <w:t>SQLPage</w:t>
-      </w:r>
-      <w:proofErr w:type="spellEnd"/>
-      <w:r>
-        <w:t xml:space="preserve"> renderiza como HTML, sin que el desarrollador tenga que escribir plantillas ni JavaScript. La arquitectura resultante es tan simple como se muestra en la Figura 4-1: el navegador habla directamente con SQLPage, y SQLPage con la base de datos, sin ningún backend propio ni API REST intermedia.</w:t>
+        <w:t>La aplicación se organiza en seis páginas, descritas a continuación.</w:t>
+      </w:r>
+    </w:p>
+    <w:p>
+      <w:pPr>
+        <w:pStyle w:val="Ttulo3"/>
+        <w:rPr>
+          <w:lang w:val="es-ES"/>
+        </w:rPr>
+      </w:pPr>
+      <w:bookmarkStart w:id="40" w:name="_Toc239595827"/>
+      <w:r>
+        <w:t>Página de inicio</w:t>
+      </w:r>
+      <w:bookmarkEnd w:id="40"/>
+    </w:p>
+    <w:p>
+      <w:pPr>
+        <w:rPr>
+          <w:lang w:val="es-ES"/>
+        </w:rPr>
+      </w:pPr>
+      <w:r>
+        <w:t>Muestra un resumen del dataset completo (número de temporadas, de deportes, y de deportes en los que ha habido competición masculina y femenina) y un formulario con cuatro desplegables</w:t>
+      </w:r>
+      <w:r>
+        <w:t xml:space="preserve">; </w:t>
+      </w:r>
+      <w:r>
+        <w:t>año, deporte, género y categoría</w:t>
+      </w:r>
+      <w:r>
+        <w:t>,</w:t>
+      </w:r>
+      <w:r>
+        <w:t xml:space="preserve"> que se muestran siempre desde el principio, cada uno con todas las opciones que existen en los datos. Al pulsar «Buscar», si los cuatro campos están rellenos se pasa directamente a la clasificación solicitada; si falta alguno, se muestra un aviso indicando exactamente qué campo falta por elegir, en lugar de dejar el botón sin reaccionar.</w:t>
       </w:r>
     </w:p>
     <w:p>
@@ -6788,18 +7095,62 @@
         </w:rPr>
       </w:pPr>
       <w:r>
-        <w:t>Figura 4-1. Arquitectura de la aplicación (navegador – SQLPage – base de datos)</w:t>
-      </w:r>
-    </w:p>
-    <w:p>
-      <w:pPr>
+        <w:rPr>
+          <w:noProof/>
+        </w:rPr>
+        <w:lastRenderedPageBreak/>
+        <w:drawing>
+          <wp:inline distT="0" distB="0" distL="0" distR="0" wp14:anchorId="5FA2908A" wp14:editId="44746007">
+            <wp:extent cx="5943600" cy="5347970"/>
+            <wp:effectExtent l="0" t="0" r="0" b="5080"/>
+            <wp:docPr id="356011705" name="Imagen 1"/>
+            <wp:cNvGraphicFramePr>
+              <a:graphicFrameLocks xmlns:a="http://schemas.openxmlformats.org/drawingml/2006/main" noChangeAspect="1"/>
+            </wp:cNvGraphicFramePr>
+            <a:graphic xmlns:a="http://schemas.openxmlformats.org/drawingml/2006/main">
+              <a:graphicData uri="http://schemas.openxmlformats.org/drawingml/2006/picture">
+                <pic:pic xmlns:pic="http://schemas.openxmlformats.org/drawingml/2006/picture">
+                  <pic:nvPicPr>
+                    <pic:cNvPr id="356011705" name=""/>
+                    <pic:cNvPicPr/>
+                  </pic:nvPicPr>
+                  <pic:blipFill>
+                    <a:blip r:embed="rId14"/>
+                    <a:stretch>
+                      <a:fillRect/>
+                    </a:stretch>
+                  </pic:blipFill>
+                  <pic:spPr>
+                    <a:xfrm>
+                      <a:off x="0" y="0"/>
+                      <a:ext cx="5943600" cy="5347970"/>
+                    </a:xfrm>
+                    <a:prstGeom prst="rect">
+                      <a:avLst/>
+                    </a:prstGeom>
+                  </pic:spPr>
+                </pic:pic>
+              </a:graphicData>
+            </a:graphic>
+          </wp:inline>
+        </w:drawing>
+      </w:r>
+      <w:r>
+        <w:t>Figura 4-2. Página de inicio</w:t>
+      </w:r>
+    </w:p>
+    <w:p>
+      <w:pPr>
+        <w:pStyle w:val="Ttulo3"/>
         <w:rPr>
           <w:lang w:val="es-ES"/>
         </w:rPr>
       </w:pPr>
-      <w:r>
-        <w:t>Se valoraron alternativas más convencionales —un backend en Flask o Django con una API propia y un frontend independiente— pero se descartaron por resultar desproporcionadas para una aplicación cuyo único cometido es consultar datos ya existentes: habrían añadido un lenguaje, un framework y una capa de API completos únicamente para trasladar filas de una tabla a una página HTML, sin ningún beneficio adicional dado que no hay lógica de negocio ni operaciones de escritura que justifiquen esa complejidad.</w:t>
-      </w:r>
+      <w:bookmarkStart w:id="41" w:name="_Toc239595828"/>
+      <w:r>
+        <w:t>Clasificación de un año, deporte, género y categoría</w:t>
+      </w:r>
+      <w:bookmarkEnd w:id="41"/>
     </w:p>
     <w:p>
       <w:pPr>
@@ -6808,7 +7159,398 @@
         </w:rPr>
       </w:pPr>
       <w:r>
-        <w:t>Todas las páginas comparten una cabecera y un menú comunes, definidos en un único fichero de configuración (shell.json) que SQLPage aplica a cada página, de forma que cambiar el título, el menú o el pie de página de toda la aplicación no requiere tocar cada fichero por separado.</w:t>
+        <w:t>Muestra la tabla de posiciones (posición, equipo y puntos) de la clasificación solicitada, excluyendo los equipos sin puesto de liga, y debajo, si corresponde, una segunda tabla con la clasificación del Trofeo Alfonso XIII de esa misma combinación. Si la combinación de año, deporte, género y categoría solicitada no existe en los datos, se muestra un aviso claro en vez de una tabla vacía.</w:t>
+      </w:r>
+    </w:p>
+    <w:p>
+      <w:pPr>
+        <w:pStyle w:val="Descripcin"/>
+        <w:rPr>
+          <w:lang w:val="es-ES"/>
+        </w:rPr>
+      </w:pPr>
+      <w:r>
+        <w:rPr>
+          <w:noProof/>
+        </w:rPr>
+        <w:lastRenderedPageBreak/>
+        <w:drawing>
+          <wp:inline distT="0" distB="0" distL="0" distR="0" wp14:anchorId="53D2C7B0" wp14:editId="3474EE4D">
+            <wp:extent cx="5943600" cy="5401945"/>
+            <wp:effectExtent l="0" t="0" r="0" b="8255"/>
+            <wp:docPr id="990116434" name="Imagen 1"/>
+            <wp:cNvGraphicFramePr>
+              <a:graphicFrameLocks xmlns:a="http://schemas.openxmlformats.org/drawingml/2006/main" noChangeAspect="1"/>
+            </wp:cNvGraphicFramePr>
+            <a:graphic xmlns:a="http://schemas.openxmlformats.org/drawingml/2006/main">
+              <a:graphicData uri="http://schemas.openxmlformats.org/drawingml/2006/picture">
+                <pic:pic xmlns:pic="http://schemas.openxmlformats.org/drawingml/2006/picture">
+                  <pic:nvPicPr>
+                    <pic:cNvPr id="990116434" name=""/>
+                    <pic:cNvPicPr/>
+                  </pic:nvPicPr>
+                  <pic:blipFill>
+                    <a:blip r:embed="rId15"/>
+                    <a:stretch>
+                      <a:fillRect/>
+                    </a:stretch>
+                  </pic:blipFill>
+                  <pic:spPr>
+                    <a:xfrm>
+                      <a:off x="0" y="0"/>
+                      <a:ext cx="5943600" cy="5401945"/>
+                    </a:xfrm>
+                    <a:prstGeom prst="rect">
+                      <a:avLst/>
+                    </a:prstGeom>
+                  </pic:spPr>
+                </pic:pic>
+              </a:graphicData>
+            </a:graphic>
+          </wp:inline>
+        </w:drawing>
+      </w:r>
+      <w:r>
+        <w:t>Figura 4-3. Clasificación de un año, deporte, género y categoría</w:t>
+      </w:r>
+    </w:p>
+    <w:p>
+      <w:pPr>
+        <w:pStyle w:val="Ttulo3"/>
+        <w:rPr>
+          <w:lang w:val="es-ES"/>
+        </w:rPr>
+      </w:pPr>
+      <w:bookmarkStart w:id="42" w:name="_Toc239595829"/>
+      <w:r>
+        <w:t>Histórico de un equipo</w:t>
+      </w:r>
+      <w:bookmarkEnd w:id="42"/>
+    </w:p>
+    <w:p>
+      <w:pPr>
+        <w:rPr>
+          <w:lang w:val="es-ES"/>
+        </w:rPr>
+      </w:pPr>
+      <w:r>
+        <w:t>Al entrar desde la opción «Equipos» del menú superior sin haber elegido todavía ningún equipo, la página muestra un listado con todos los equipos que aparecen en el dataset, cada uno con el número de participaciones y de deportes distintos en los que ha competido (Figura 4-4).</w:t>
+      </w:r>
+    </w:p>
+    <w:p>
+      <w:pPr>
+        <w:pStyle w:val="Descripcin"/>
+      </w:pPr>
+      <w:r>
+        <w:rPr>
+          <w:iCs w:val="0"/>
+          <w:noProof/>
+          <w:sz w:val="22"/>
+          <w:szCs w:val="24"/>
+        </w:rPr>
+        <w:lastRenderedPageBreak/>
+        <w:drawing>
+          <wp:inline distT="0" distB="0" distL="0" distR="0" wp14:anchorId="130D1A00" wp14:editId="4325F905">
+            <wp:extent cx="5943600" cy="5478780"/>
+            <wp:effectExtent l="0" t="0" r="0" b="7620"/>
+            <wp:docPr id="2042091277" name="Imagen 1"/>
+            <wp:cNvGraphicFramePr>
+              <a:graphicFrameLocks xmlns:a="http://schemas.openxmlformats.org/drawingml/2006/main" noChangeAspect="1"/>
+            </wp:cNvGraphicFramePr>
+            <a:graphic xmlns:a="http://schemas.openxmlformats.org/drawingml/2006/main">
+              <a:graphicData uri="http://schemas.openxmlformats.org/drawingml/2006/picture">
+                <pic:pic xmlns:pic="http://schemas.openxmlformats.org/drawingml/2006/picture">
+                  <pic:nvPicPr>
+                    <pic:cNvPr id="2042091277" name=""/>
+                    <pic:cNvPicPr/>
+                  </pic:nvPicPr>
+                  <pic:blipFill>
+                    <a:blip r:embed="rId16"/>
+                    <a:stretch>
+                      <a:fillRect/>
+                    </a:stretch>
+                  </pic:blipFill>
+                  <pic:spPr>
+                    <a:xfrm>
+                      <a:off x="0" y="0"/>
+                      <a:ext cx="5943600" cy="5478780"/>
+                    </a:xfrm>
+                    <a:prstGeom prst="rect">
+                      <a:avLst/>
+                    </a:prstGeom>
+                  </pic:spPr>
+                </pic:pic>
+              </a:graphicData>
+            </a:graphic>
+          </wp:inline>
+        </w:drawing>
+      </w:r>
+      <w:r>
+        <w:t xml:space="preserve">Figura 4-4. </w:t>
+      </w:r>
+      <w:r>
+        <w:t>Listado de todos los equipos</w:t>
+      </w:r>
+    </w:p>
+    <w:p>
+      <w:pPr>
+        <w:rPr>
+          <w:u w:val="single"/>
+        </w:rPr>
+      </w:pPr>
+      <w:r>
+        <w:rPr>
+          <w:noProof/>
+          <w:u w:val="single"/>
+        </w:rPr>
+        <w:lastRenderedPageBreak/>
+        <w:drawing>
+          <wp:inline distT="0" distB="0" distL="0" distR="0" wp14:anchorId="06D97B30" wp14:editId="1E6B9777">
+            <wp:extent cx="5943600" cy="5626100"/>
+            <wp:effectExtent l="0" t="0" r="0" b="0"/>
+            <wp:docPr id="972953794" name="Imagen 1"/>
+            <wp:cNvGraphicFramePr>
+              <a:graphicFrameLocks xmlns:a="http://schemas.openxmlformats.org/drawingml/2006/main" noChangeAspect="1"/>
+            </wp:cNvGraphicFramePr>
+            <a:graphic xmlns:a="http://schemas.openxmlformats.org/drawingml/2006/main">
+              <a:graphicData uri="http://schemas.openxmlformats.org/drawingml/2006/picture">
+                <pic:pic xmlns:pic="http://schemas.openxmlformats.org/drawingml/2006/picture">
+                  <pic:nvPicPr>
+                    <pic:cNvPr id="972953794" name=""/>
+                    <pic:cNvPicPr/>
+                  </pic:nvPicPr>
+                  <pic:blipFill>
+                    <a:blip r:embed="rId17"/>
+                    <a:stretch>
+                      <a:fillRect/>
+                    </a:stretch>
+                  </pic:blipFill>
+                  <pic:spPr>
+                    <a:xfrm>
+                      <a:off x="0" y="0"/>
+                      <a:ext cx="5943600" cy="5626100"/>
+                    </a:xfrm>
+                    <a:prstGeom prst="rect">
+                      <a:avLst/>
+                    </a:prstGeom>
+                  </pic:spPr>
+                </pic:pic>
+              </a:graphicData>
+            </a:graphic>
+          </wp:inline>
+        </w:drawing>
+      </w:r>
+    </w:p>
+    <w:p>
+      <w:pPr>
+        <w:pStyle w:val="Descripcin"/>
+        <w:rPr>
+          <w:lang w:val="es-ES"/>
+        </w:rPr>
+      </w:pPr>
+      <w:r>
+        <w:t>Figura 4-</w:t>
+      </w:r>
+      <w:r>
+        <w:t>5</w:t>
+      </w:r>
+      <w:r>
+        <w:t xml:space="preserve">. </w:t>
+      </w:r>
+      <w:r>
+        <w:t>Histórico de un equipo</w:t>
+      </w:r>
+    </w:p>
+    <w:p>
+      <w:pPr>
+        <w:rPr>
+          <w:lang w:val="es-ES"/>
+        </w:rPr>
+      </w:pPr>
+      <w:r>
+        <w:t>Al elegir uno de ellos, la página recoge toda la trayectoria de ese equipo a lo largo de los años: deporte, género, categoría, posición de liga (con una flecha que indica ascenso o descenso, cuando lo hubo), puntos y posición en el Trofeo Alfonso XIII de cada temporada en la que ha participado, además de un resumen con el número de participaciones, primeros puestos, ascensos y descensos totales. El año de cada fila enlaza directamente a la clasificación completa de esa combinación (Figura 4-5).</w:t>
+      </w:r>
+    </w:p>
+    <w:p>
+      <w:pPr>
+        <w:pStyle w:val="Ttulo3"/>
+        <w:rPr>
+          <w:lang w:val="es-ES"/>
+        </w:rPr>
+      </w:pPr>
+      <w:bookmarkStart w:id="43" w:name="_Toc239595830"/>
+      <w:r>
+        <w:lastRenderedPageBreak/>
+        <w:t>Histórico de un deporte</w:t>
+      </w:r>
+      <w:bookmarkEnd w:id="43"/>
+    </w:p>
+    <w:p>
+      <w:r>
+        <w:t>Al entrar desde la opción «Deportes» del menú superior sin haber elegido todavía ningún deporte, la página muestra un listado con todos los deportes disputados a lo largo del histórico, cada uno con el número de participaciones y de temporadas registradas (Figura 4-6). Al elegir uno, se muestran dos pestañas: todas las combinaciones de año, género y categoría disputadas en ese deporte, cada una con enlace a su clasificación completa, o bien la relación completa de sus campeones a lo largo de los años, con ese mismo enlace en cada fila (Figura 4-7).</w:t>
+      </w:r>
+    </w:p>
+    <w:p/>
+    <w:p>
+      <w:r>
+        <w:rPr>
+          <w:noProof/>
+          <w:lang w:val="es-ES"/>
+        </w:rPr>
+        <w:drawing>
+          <wp:inline distT="0" distB="0" distL="0" distR="0" wp14:anchorId="43403253" wp14:editId="47E0504C">
+            <wp:extent cx="5943600" cy="5482590"/>
+            <wp:effectExtent l="0" t="0" r="0" b="3810"/>
+            <wp:docPr id="1953892275" name="Imagen 1"/>
+            <wp:cNvGraphicFramePr>
+              <a:graphicFrameLocks xmlns:a="http://schemas.openxmlformats.org/drawingml/2006/main" noChangeAspect="1"/>
+            </wp:cNvGraphicFramePr>
+            <a:graphic xmlns:a="http://schemas.openxmlformats.org/drawingml/2006/main">
+              <a:graphicData uri="http://schemas.openxmlformats.org/drawingml/2006/picture">
+                <pic:pic xmlns:pic="http://schemas.openxmlformats.org/drawingml/2006/picture">
+                  <pic:nvPicPr>
+                    <pic:cNvPr id="1953892275" name=""/>
+                    <pic:cNvPicPr/>
+                  </pic:nvPicPr>
+                  <pic:blipFill>
+                    <a:blip r:embed="rId18"/>
+                    <a:stretch>
+                      <a:fillRect/>
+                    </a:stretch>
+                  </pic:blipFill>
+                  <pic:spPr>
+                    <a:xfrm>
+                      <a:off x="0" y="0"/>
+                      <a:ext cx="5943600" cy="5482590"/>
+                    </a:xfrm>
+                    <a:prstGeom prst="rect">
+                      <a:avLst/>
+                    </a:prstGeom>
+                  </pic:spPr>
+                </pic:pic>
+              </a:graphicData>
+            </a:graphic>
+          </wp:inline>
+        </w:drawing>
+      </w:r>
+    </w:p>
+    <w:p>
+      <w:pPr>
+        <w:rPr>
+          <w:lang w:val="es-ES"/>
+        </w:rPr>
+      </w:pPr>
+    </w:p>
+    <w:p>
+      <w:pPr>
+        <w:pStyle w:val="Descripcin"/>
+        <w:rPr>
+          <w:lang w:val="es-ES"/>
+        </w:rPr>
+      </w:pPr>
+      <w:r>
+        <w:t>Figura 4-6. Listado de deportes</w:t>
+      </w:r>
+    </w:p>
+    <w:p>
+      <w:pPr>
+        <w:rPr>
+          <w:lang w:val="es-ES"/>
+        </w:rPr>
+      </w:pPr>
+    </w:p>
+    <w:p>
+      <w:pPr>
+        <w:pStyle w:val="Descripcin"/>
+        <w:rPr>
+          <w:lang w:val="es-ES"/>
+        </w:rPr>
+      </w:pPr>
+      <w:r>
+        <w:rPr>
+          <w:iCs w:val="0"/>
+          <w:noProof/>
+          <w:sz w:val="22"/>
+          <w:szCs w:val="24"/>
+        </w:rPr>
+        <w:drawing>
+          <wp:inline distT="0" distB="0" distL="0" distR="0" wp14:anchorId="4E4C54EF" wp14:editId="7FCD3272">
+            <wp:extent cx="5943600" cy="5491480"/>
+            <wp:effectExtent l="0" t="0" r="0" b="0"/>
+            <wp:docPr id="1574956440" name="Imagen 1"/>
+            <wp:cNvGraphicFramePr>
+              <a:graphicFrameLocks xmlns:a="http://schemas.openxmlformats.org/drawingml/2006/main" noChangeAspect="1"/>
+            </wp:cNvGraphicFramePr>
+            <a:graphic xmlns:a="http://schemas.openxmlformats.org/drawingml/2006/main">
+              <a:graphicData uri="http://schemas.openxmlformats.org/drawingml/2006/picture">
+                <pic:pic xmlns:pic="http://schemas.openxmlformats.org/drawingml/2006/picture">
+                  <pic:nvPicPr>
+                    <pic:cNvPr id="1574956440" name=""/>
+                    <pic:cNvPicPr/>
+                  </pic:nvPicPr>
+                  <pic:blipFill>
+                    <a:blip r:embed="rId19"/>
+                    <a:stretch>
+                      <a:fillRect/>
+                    </a:stretch>
+                  </pic:blipFill>
+                  <pic:spPr>
+                    <a:xfrm>
+                      <a:off x="0" y="0"/>
+                      <a:ext cx="5943600" cy="5491480"/>
+                    </a:xfrm>
+                    <a:prstGeom prst="rect">
+                      <a:avLst/>
+                    </a:prstGeom>
+                  </pic:spPr>
+                </pic:pic>
+              </a:graphicData>
+            </a:graphic>
+          </wp:inline>
+        </w:drawing>
+      </w:r>
+      <w:r>
+        <w:t>Figura 4</w:t>
+      </w:r>
+      <w:r>
+        <w:t>-7</w:t>
+      </w:r>
+      <w:r>
+        <w:t>. Histórico de un deporte</w:t>
+      </w:r>
+    </w:p>
+    <w:p>
+      <w:pPr>
+        <w:pStyle w:val="Ttulo3"/>
+        <w:rPr>
+          <w:lang w:val="es-ES"/>
+        </w:rPr>
+      </w:pPr>
+      <w:bookmarkStart w:id="44" w:name="_Toc239595831"/>
+      <w:r>
+        <w:t>Explorador de estadísticas</w:t>
+      </w:r>
+      <w:bookmarkEnd w:id="44"/>
+    </w:p>
+    <w:p>
+      <w:pPr>
+        <w:rPr>
+          <w:lang w:val="es-ES"/>
+        </w:rPr>
+      </w:pPr>
+      <w:r>
+        <w:t>Se describe en detalle en el apartado 4.5.</w:t>
+      </w:r>
+    </w:p>
+    <w:p>
+      <w:pPr>
+        <w:pStyle w:val="Descripcin"/>
+        <w:rPr>
+          <w:lang w:val="es-ES"/>
+        </w:rPr>
+      </w:pPr>
+      <w:r>
+        <w:t>Figura 4-8. Explorador de estadísticas</w:t>
       </w:r>
     </w:p>
     <w:p>
@@ -6818,305 +7560,7 @@
           <w:lang w:val="es-ES"/>
         </w:rPr>
       </w:pPr>
-      <w:bookmarkStart w:id="38" w:name="_Toc239546161"/>
-      <w:r>
-        <w:lastRenderedPageBreak/>
-        <w:t>El contrato de datos</w:t>
-      </w:r>
-      <w:bookmarkEnd w:id="38"/>
-    </w:p>
-    <w:p>
-      <w:pPr>
-        <w:rPr>
-          <w:lang w:val="es-ES"/>
-        </w:rPr>
-      </w:pPr>
-      <w:r>
-        <w:t>La aplicación no asume nada sobre el contenido de la base de datos: se limita a exigir que exista una tabla Clasificaciones con las columnas descritas en el apartado 3.3, documentadas en un fichero schema.sql que actúa como contrato entre los datos y la aplicación. Cualquier base de datos MySQL o MariaDB que exponga esa misma tabla puede conectarse a la aplicación sin modificar ni una línea de las páginas: ni el número de deportes, ni los equipos, ni el rango de años están fijados en ningún sitio del código, sino que se obtienen siempre mediante consultas DISTINCT o agregaciones sobre la tabla en el momento de renderizar cada página. Esto permite, en principio, reutilizar la misma aplicación para digitalizar el histórico de otra competición universitaria distinta sin más que cargar sus datos con ese mismo formato.</w:t>
-      </w:r>
-    </w:p>
-    <w:p>
-      <w:pPr>
-        <w:pStyle w:val="Ttulo2"/>
-        <w:rPr>
-          <w:lang w:val="es-ES"/>
-        </w:rPr>
-      </w:pPr>
-      <w:bookmarkStart w:id="39" w:name="_Toc239546162"/>
-      <w:r>
-        <w:t>Páginas y funcionalidades</w:t>
-      </w:r>
-      <w:bookmarkEnd w:id="39"/>
-    </w:p>
-    <w:p>
-      <w:pPr>
-        <w:rPr>
-          <w:lang w:val="es-ES"/>
-        </w:rPr>
-      </w:pPr>
-      <w:r>
-        <w:t>La aplicación se organiza en seis páginas, descritas a continuación.</w:t>
-      </w:r>
-    </w:p>
-    <w:p>
-      <w:pPr>
-        <w:pStyle w:val="Ttulo3"/>
-        <w:rPr>
-          <w:lang w:val="es-ES"/>
-        </w:rPr>
-      </w:pPr>
-      <w:bookmarkStart w:id="40" w:name="_Toc239546163"/>
-      <w:r>
-        <w:t>Página de inicio</w:t>
-      </w:r>
-      <w:bookmarkEnd w:id="40"/>
-    </w:p>
-    <w:p>
-      <w:pPr>
-        <w:rPr>
-          <w:lang w:val="es-ES"/>
-        </w:rPr>
-      </w:pPr>
-      <w:r>
-        <w:t>Muestra un resumen del dataset completo (número de temporadas, de deportes, y de deportes en los que ha habido competición masculina y femenina) y un formulario con cuatro desplegables</w:t>
-      </w:r>
-      <w:r>
-        <w:t xml:space="preserve">; </w:t>
-      </w:r>
-      <w:r>
-        <w:t>año, deporte, género y categoría</w:t>
-      </w:r>
-      <w:r>
-        <w:t>,</w:t>
-      </w:r>
-      <w:r>
-        <w:t xml:space="preserve"> que se muestran siempre desde el principio, cada uno con todas las opciones que existen en los datos. Al pulsar «Buscar», si los cuatro campos están rellenos se pasa directamente a la clasificación solicitada; si falta alguno, se muestra un aviso indicando exactamente qué campo falta por elegir, en lugar de dejar el botón sin reaccionar.</w:t>
-      </w:r>
-    </w:p>
-    <w:p>
-      <w:pPr>
-        <w:rPr>
-          <w:lang w:val="es-ES"/>
-        </w:rPr>
-      </w:pPr>
-      <w:r>
-        <w:rPr>
-          <w:i/>
-        </w:rPr>
-        <w:t>[INSERTAR CAPTURA: página de inicio, mostrando las cifras generales y los cuatro desplegables de búsqueda]</w:t>
-      </w:r>
-    </w:p>
-    <w:p>
-      <w:pPr>
-        <w:pStyle w:val="Descripcin"/>
-        <w:rPr>
-          <w:lang w:val="es-ES"/>
-        </w:rPr>
-      </w:pPr>
-      <w:r>
-        <w:t>Figura 4-2. Página de inicio</w:t>
-      </w:r>
-    </w:p>
-    <w:p>
-      <w:pPr>
-        <w:pStyle w:val="Ttulo3"/>
-        <w:rPr>
-          <w:lang w:val="es-ES"/>
-        </w:rPr>
-      </w:pPr>
-      <w:bookmarkStart w:id="41" w:name="_Toc239546164"/>
-      <w:r>
-        <w:t>Clasificación de un año, deporte, género y categoría</w:t>
-      </w:r>
-      <w:bookmarkEnd w:id="41"/>
-    </w:p>
-    <w:p>
-      <w:pPr>
-        <w:rPr>
-          <w:lang w:val="es-ES"/>
-        </w:rPr>
-      </w:pPr>
-      <w:r>
-        <w:t xml:space="preserve">Muestra la tabla de posiciones (posición, equipo y puntos) de la clasificación solicitada, excluyendo los equipos sin puesto de liga, y debajo, si corresponde, una segunda tabla con la clasificación del Trofeo Alfonso XIII de esa misma combinación. Si </w:t>
-      </w:r>
-      <w:r>
-        <w:lastRenderedPageBreak/>
-        <w:t>la combinación de año, deporte, género y categoría solicitada no existe en los datos, se muestra un aviso claro en vez de una tabla vacía.</w:t>
-      </w:r>
-    </w:p>
-    <w:p>
-      <w:pPr>
-        <w:rPr>
-          <w:lang w:val="es-ES"/>
-        </w:rPr>
-      </w:pPr>
-      <w:r>
-        <w:rPr>
-          <w:i/>
-        </w:rPr>
-        <w:t>[INSERTAR CAPTURA: página de una clasificación concreta, con la tabla de liga y, debajo, la tabla del Trofeo Alfonso]</w:t>
-      </w:r>
-    </w:p>
-    <w:p>
-      <w:pPr>
-        <w:pStyle w:val="Descripcin"/>
-        <w:rPr>
-          <w:lang w:val="es-ES"/>
-        </w:rPr>
-      </w:pPr>
-      <w:r>
-        <w:t>Figura 4-3. Clasificación de un año, deporte, género y categoría</w:t>
-      </w:r>
-    </w:p>
-    <w:p>
-      <w:pPr>
-        <w:pStyle w:val="Ttulo3"/>
-        <w:rPr>
-          <w:lang w:val="es-ES"/>
-        </w:rPr>
-      </w:pPr>
-      <w:bookmarkStart w:id="42" w:name="_Toc239546165"/>
-      <w:r>
-        <w:t>Histórico de un equipo</w:t>
-      </w:r>
-      <w:bookmarkEnd w:id="42"/>
-    </w:p>
-    <w:p>
-      <w:pPr>
-        <w:rPr>
-          <w:lang w:val="es-ES"/>
-        </w:rPr>
-      </w:pPr>
-      <w:r>
-        <w:t>Recoge toda la trayectoria de un equipo a lo largo de los años: deporte, género, categoría, posición de liga (con una flecha que indica ascenso o descenso, cuando lo hubo), puntos y posición en el Trofeo Alfonso XIII de cada temporada en la que ha participado, además de un resumen con el número de participaciones, primeros puestos, ascensos y descensos totales.</w:t>
-      </w:r>
-    </w:p>
-    <w:p>
-      <w:pPr>
-        <w:rPr>
-          <w:lang w:val="es-ES"/>
-        </w:rPr>
-      </w:pPr>
-      <w:r>
-        <w:rPr>
-          <w:i/>
-        </w:rPr>
-        <w:t>[INSERTAR CAPTURA: histórico de un equipo con varias temporadas]</w:t>
-      </w:r>
-    </w:p>
-    <w:p>
-      <w:pPr>
-        <w:pStyle w:val="Descripcin"/>
-        <w:rPr>
-          <w:lang w:val="es-ES"/>
-        </w:rPr>
-      </w:pPr>
-      <w:r>
-        <w:t>Figura 4-4. Histórico de un equipo</w:t>
-      </w:r>
-    </w:p>
-    <w:p>
-      <w:pPr>
-        <w:pStyle w:val="Ttulo3"/>
-        <w:rPr>
-          <w:lang w:val="es-ES"/>
-        </w:rPr>
-      </w:pPr>
-      <w:bookmarkStart w:id="43" w:name="_Toc239546166"/>
-      <w:r>
-        <w:t>Histórico de un deporte</w:t>
-      </w:r>
-      <w:bookmarkEnd w:id="43"/>
-    </w:p>
-    <w:p>
-      <w:pPr>
-        <w:rPr>
-          <w:lang w:val="es-ES"/>
-        </w:rPr>
-      </w:pPr>
-      <w:r>
-        <w:t>Sin especificar ningún deporte, esta página muestra un listado con todos los deportes disputados a lo largo del histórico. Al elegir uno, se pueden consultar todas las combinaciones de año, género y categoría disputadas en ese deporte, o bien la relación completa de sus campeones a lo largo de los años.</w:t>
-      </w:r>
-    </w:p>
-    <w:p>
-      <w:pPr>
-        <w:rPr>
-          <w:lang w:val="es-ES"/>
-        </w:rPr>
-      </w:pPr>
-      <w:r>
-        <w:rPr>
-          <w:i/>
-        </w:rPr>
-        <w:t>[INSERTAR CAPTURA: página de un deporte, con las pestañas de clasificaciones y de campeones]</w:t>
-      </w:r>
-    </w:p>
-    <w:p>
-      <w:pPr>
-        <w:pStyle w:val="Descripcin"/>
-        <w:rPr>
-          <w:lang w:val="es-ES"/>
-        </w:rPr>
-      </w:pPr>
-      <w:r>
-        <w:t>Figura 4-5. Histórico de un deporte</w:t>
-      </w:r>
-    </w:p>
-    <w:p>
-      <w:pPr>
-        <w:pStyle w:val="Ttulo3"/>
-        <w:rPr>
-          <w:lang w:val="es-ES"/>
-        </w:rPr>
-      </w:pPr>
-      <w:bookmarkStart w:id="44" w:name="_Toc239546167"/>
-      <w:r>
-        <w:t>Explorador de estadísticas</w:t>
-      </w:r>
-      <w:bookmarkEnd w:id="44"/>
-    </w:p>
-    <w:p>
-      <w:pPr>
-        <w:rPr>
-          <w:lang w:val="es-ES"/>
-        </w:rPr>
-      </w:pPr>
-      <w:r>
-        <w:t>Se describe en detalle en el apartado 4.5.</w:t>
-      </w:r>
-    </w:p>
-    <w:p>
-      <w:pPr>
-        <w:rPr>
-          <w:lang w:val="es-ES"/>
-        </w:rPr>
-      </w:pPr>
-      <w:r>
-        <w:rPr>
-          <w:i/>
-        </w:rPr>
-        <w:t>[INSERTAR CAPTURA: página de estadísticas, con el desplegable de estadísticas y un resultado ya calculado]</w:t>
-      </w:r>
-    </w:p>
-    <w:p>
-      <w:pPr>
-        <w:pStyle w:val="Descripcin"/>
-        <w:rPr>
-          <w:lang w:val="es-ES"/>
-        </w:rPr>
-      </w:pPr>
-      <w:r>
-        <w:t>Figura 4-6. Explorador de estadísticas</w:t>
-      </w:r>
-    </w:p>
-    <w:p>
-      <w:pPr>
-        <w:pStyle w:val="Ttulo2"/>
-        <w:rPr>
-          <w:lang w:val="es-ES"/>
-        </w:rPr>
-      </w:pPr>
-      <w:bookmarkStart w:id="45" w:name="_Toc239546168"/>
+      <w:bookmarkStart w:id="45" w:name="_Toc239595832"/>
       <w:r>
         <w:lastRenderedPageBreak/>
         <w:t>Explorador de estadísticas</w:t>
@@ -7168,7 +7612,7 @@
           <w:lang w:val="es-ES"/>
         </w:rPr>
       </w:pPr>
-      <w:bookmarkStart w:id="46" w:name="_Toc239546169"/>
+      <w:bookmarkStart w:id="46" w:name="_Toc239595833"/>
       <w:r>
         <w:t>Diseño visual</w:t>
       </w:r>
@@ -7209,7 +7653,7 @@
           <w:lang w:val="es-ES"/>
         </w:rPr>
       </w:pPr>
-      <w:bookmarkStart w:id="47" w:name="_Toc239546170"/>
+      <w:bookmarkStart w:id="47" w:name="_Toc239595834"/>
       <w:r>
         <w:lastRenderedPageBreak/>
         <w:t>Despliegue</w:t>
@@ -7233,7 +7677,7 @@
           <w:lang w:val="es-ES"/>
         </w:rPr>
       </w:pPr>
-      <w:bookmarkStart w:id="48" w:name="_Toc239546171"/>
+      <w:bookmarkStart w:id="48" w:name="_Toc239595835"/>
       <w:r>
         <w:t>Contenerización con Docker</w:t>
       </w:r>
@@ -7282,7 +7726,7 @@
           <w:lang w:val="es-ES"/>
         </w:rPr>
       </w:pPr>
-      <w:bookmarkStart w:id="49" w:name="_Toc239546172"/>
+      <w:bookmarkStart w:id="49" w:name="_Toc239595836"/>
       <w:r>
         <w:t>Dos imágenes independientes, una red compartida</w:t>
       </w:r>
@@ -7300,26 +7744,93 @@
     </w:p>
     <w:p>
       <w:pPr>
+        <w:pStyle w:val="Descripcin"/>
         <w:rPr>
           <w:lang w:val="es-ES"/>
         </w:rPr>
       </w:pPr>
       <w:r>
         <w:rPr>
-          <w:i/>
-        </w:rPr>
-        <w:t>[INSERTAR CAPTURA: diagrama o captura de terminal mostrando los dos contenedores en ejecución (docker ps) y la red que los conecta]</w:t>
-      </w:r>
-    </w:p>
-    <w:p>
-      <w:pPr>
-        <w:pStyle w:val="Descripcin"/>
+          <w:iCs w:val="0"/>
+          <w:noProof/>
+          <w:sz w:val="22"/>
+          <w:szCs w:val="24"/>
+        </w:rPr>
+        <w:drawing>
+          <wp:inline distT="0" distB="0" distL="0" distR="0" wp14:anchorId="0DB1D449" wp14:editId="1083249D">
+            <wp:extent cx="5943600" cy="490220"/>
+            <wp:effectExtent l="0" t="0" r="0" b="5080"/>
+            <wp:docPr id="1094105581" name="Imagen 1"/>
+            <wp:cNvGraphicFramePr>
+              <a:graphicFrameLocks xmlns:a="http://schemas.openxmlformats.org/drawingml/2006/main" noChangeAspect="1"/>
+            </wp:cNvGraphicFramePr>
+            <a:graphic xmlns:a="http://schemas.openxmlformats.org/drawingml/2006/main">
+              <a:graphicData uri="http://schemas.openxmlformats.org/drawingml/2006/picture">
+                <pic:pic xmlns:pic="http://schemas.openxmlformats.org/drawingml/2006/picture">
+                  <pic:nvPicPr>
+                    <pic:cNvPr id="1094105581" name=""/>
+                    <pic:cNvPicPr/>
+                  </pic:nvPicPr>
+                  <pic:blipFill>
+                    <a:blip r:embed="rId20"/>
+                    <a:stretch>
+                      <a:fillRect/>
+                    </a:stretch>
+                  </pic:blipFill>
+                  <pic:spPr>
+                    <a:xfrm>
+                      <a:off x="0" y="0"/>
+                      <a:ext cx="5943600" cy="490220"/>
+                    </a:xfrm>
+                    <a:prstGeom prst="rect">
+                      <a:avLst/>
+                    </a:prstGeom>
+                  </pic:spPr>
+                </pic:pic>
+              </a:graphicData>
+            </a:graphic>
+          </wp:inline>
+        </w:drawing>
+      </w:r>
+      <w:r>
+        <w:t>Figura 5-1. Contenedores de datos y de aplicación sobre la red compartida</w:t>
+      </w:r>
+    </w:p>
+    <w:p>
+      <w:pPr>
+        <w:pStyle w:val="Ttulo2"/>
         <w:rPr>
           <w:lang w:val="es-ES"/>
         </w:rPr>
       </w:pPr>
-      <w:r>
-        <w:t>Figura 5-1. Contenedores de datos y de aplicación sobre la red compartida</w:t>
+      <w:bookmarkStart w:id="50" w:name="_Toc239595837"/>
+      <w:r>
+        <w:t>Despliegue en un servidor real</w:t>
+      </w:r>
+      <w:bookmarkEnd w:id="50"/>
+    </w:p>
+    <w:p>
+      <w:pPr>
+        <w:rPr>
+          <w:lang w:val="es-ES"/>
+        </w:rPr>
+      </w:pPr>
+      <w:r>
+        <w:t xml:space="preserve">Además de ejecutarse en local para desarrollo, la aplicación se ha desplegado en una máquina virtual del Departamento de Arquitectura de Computadores y Automática de la UCM, accesible únicamente a través de la red del campus o de su VPN. El despliegue se realizó transfiriendo el proyecto por SFTP, generando credenciales </w:t>
+      </w:r>
+      <w:r>
+        <w:lastRenderedPageBreak/>
+        <w:t>de base de datos nuevas y robustas específicas para ese entorno (nunca las mismas que se usan en desarrollo local) y configurando SQLPage en modo de producción, en el que se cachean las páginas y se ocultan los detalles internos de cualquier error frente al usuario final.</w:t>
+      </w:r>
+    </w:p>
+    <w:p>
+      <w:pPr>
+        <w:rPr>
+          <w:lang w:val="es-ES"/>
+        </w:rPr>
+      </w:pPr>
+      <w:r>
+        <w:t>Al no estar el puerto de la aplicación expuesto públicamente en esa máquina, el acceso durante las pruebas se realizó mediante un túnel SSH sobre el mismo puerto utilizado para la conexión remota, quedando pendiente, para una publicación definitiva, solicitar la apertura de un puerto público o su integración detrás de un servidor web ya existente.</w:t>
       </w:r>
     </w:p>
     <w:p>
@@ -7329,11 +7840,11 @@
           <w:lang w:val="es-ES"/>
         </w:rPr>
       </w:pPr>
-      <w:bookmarkStart w:id="50" w:name="_Toc239546173"/>
-      <w:r>
-        <w:t>Despliegue en un servidor real</w:t>
-      </w:r>
-      <w:bookmarkEnd w:id="50"/>
+      <w:bookmarkStart w:id="51" w:name="_Toc239595838"/>
+      <w:r>
+        <w:t>Incidencia de compatibilidad de CPU y migración a MariaDB</w:t>
+      </w:r>
+      <w:bookmarkEnd w:id="51"/>
     </w:p>
     <w:p>
       <w:pPr>
@@ -7342,12 +7853,60 @@
         </w:rPr>
       </w:pPr>
       <w:r>
-        <w:t xml:space="preserve">Además de ejecutarse en local para desarrollo, la aplicación se ha desplegado en una máquina virtual del Departamento de Arquitectura de Computadores y Automática de la UCM, accesible únicamente a través de la red del campus o de su </w:t>
-      </w:r>
+        <w:t>Al desplegar por primera vez la imagen de base de datos en el servidor del departamento, el contenedor entraba en un bucle de reinicio con el error «Fatal glibc error: CPU does not support x86-64-v2». La causa resultó ser que esa máquina virtual expone a sus contenedores una CPU virtual genérica («Common KVM processor»), pensada para ser compatible con distintos servidores físicos subyacentes, que carece de las instrucciones (SSE4.2, POPCNT) que las imágenes oficiales recientes de MySQL exigen desde que su sistema base se compila con un nivel de arquitectura x86-64-v2.</w:t>
+      </w:r>
+    </w:p>
+    <w:p>
+      <w:pPr>
+        <w:rPr>
+          <w:lang w:val="es-ES"/>
+        </w:rPr>
+      </w:pPr>
+      <w:r>
+        <w:t>Descartada la opción de modificar la configuración de la máquina virtual</w:t>
+      </w:r>
+      <w:r>
+        <w:t xml:space="preserve">, </w:t>
+      </w:r>
+      <w:r>
+        <w:t>fuera del alcance de este trabajo, se comprobó qué alternativas eran compatibles con esa CPU. MariaDB, un motor de base de datos derivado de MySQL con el que comparte protocolo de red y dialecto SQL, sí resultó compatible, por lo que se sustituyó MySQL por mariadb:10.11 en la imagen de datos. Al compartir MariaDB el mismo protocolo de red que MySQL, SQLPage se conecta exactamente igual, y ninguna de las consultas SQL de la aplicación</w:t>
+      </w:r>
+      <w:r>
+        <w:t xml:space="preserve">, </w:t>
+      </w:r>
+      <w:r>
+        <w:t>incluidas las funciones de agregación en JSON empleadas en varios formularios</w:t>
+      </w:r>
+      <w:r>
+        <w:t>,</w:t>
+      </w:r>
+      <w:r>
+        <w:t xml:space="preserve"> tuvo que modificarse.</w:t>
+      </w:r>
+    </w:p>
+    <w:p>
+      <w:pPr>
+        <w:rPr>
+          <w:lang w:val="es-ES"/>
+        </w:rPr>
+      </w:pPr>
+      <w:r>
+        <w:t>Esta incidencia, aunque anecdótica, ilustra un principio general de cualquier despliegue en un entorno que no se controla por completo: conviene comprobar la compatibilidad real del software en el hardware (o hardware virtualizado) de destino, en lugar de asumir que el mismo comportamiento observado en desarrollo se sostendrá siempre en producción.</w:t>
+      </w:r>
+    </w:p>
+    <w:p>
+      <w:pPr>
+        <w:pStyle w:val="Ttulo1"/>
+        <w:rPr>
+          <w:lang w:val="es-ES"/>
+        </w:rPr>
+      </w:pPr>
+      <w:bookmarkStart w:id="52" w:name="_Toc239595839"/>
       <w:r>
         <w:lastRenderedPageBreak/>
-        <w:t>VPN. El despliegue se realizó transfiriendo el proyecto por SFTP, generando credenciales de base de datos nuevas y robustas específicas para ese entorno (nunca las mismas que se usan en desarrollo local) y configurando SQLPage en modo de producción, en el que se cachean las páginas y se ocultan los detalles internos de cualquier error frente al usuario final.</w:t>
-      </w:r>
+        <w:t>Tecnologías empleadas</w:t>
+      </w:r>
+      <w:bookmarkEnd w:id="52"/>
     </w:p>
     <w:p>
       <w:pPr>
@@ -7356,7 +7915,7 @@
         </w:rPr>
       </w:pPr>
       <w:r>
-        <w:t>Al no estar el puerto de la aplicación expuesto públicamente en esa máquina, el acceso durante las pruebas se realizó mediante un túnel SSH sobre el mismo puerto utilizado para la conexión remota, quedando pendiente, para una publicación definitiva, solicitar la apertura de un puerto público o su integración detrás de un servidor web ya existente.</w:t>
+        <w:t>Este capítulo recoge, a modo de referencia, las principales tecnologías, lenguajes, bibliotecas y herramientas empleadas a lo largo de todo el trabajo, tanto en la fase de tratamiento de los datos como en la de la aplicación web.</w:t>
       </w:r>
     </w:p>
     <w:p>
@@ -7366,85 +7925,77 @@
           <w:lang w:val="es-ES"/>
         </w:rPr>
       </w:pPr>
-      <w:bookmarkStart w:id="51" w:name="_Toc239546174"/>
-      <w:r>
-        <w:t>Incidencia de compatibilidad de CPU y migración a MariaDB</w:t>
-      </w:r>
-      <w:bookmarkEnd w:id="51"/>
-    </w:p>
-    <w:p>
-      <w:pPr>
+      <w:bookmarkStart w:id="53" w:name="_Toc239595840"/>
+      <w:r>
+        <w:t>Lenguajes y bases de datos</w:t>
+      </w:r>
+      <w:bookmarkEnd w:id="53"/>
+    </w:p>
+    <w:p>
+      <w:pPr>
+        <w:pStyle w:val="Listaconvietas"/>
         <w:rPr>
           <w:lang w:val="es-ES"/>
         </w:rPr>
       </w:pPr>
       <w:r>
-        <w:t>Al desplegar por primera vez la imagen de base de datos en el servidor del departamento, el contenedor entraba en un bucle de reinicio con el error «Fatal glibc error: CPU does not support x86-64-v2». La causa resultó ser que esa máquina virtual expone a sus contenedores una CPU virtual genérica («Common KVM processor»), pensada para ser compatible con distintos servidores físicos subyacentes, que carece de las instrucciones (SSE4.2, POPCNT) que las imágenes oficiales recientes de MySQL exigen desde que su sistema base se compila con un nivel de arquitectura x86-64-v2.</w:t>
-      </w:r>
-    </w:p>
-    <w:p>
-      <w:pPr>
+        <w:t>SQL, como lenguaje principal tanto de la aplicación web (todas sus páginas están escritas en SQL) como del propio proceso de digitalización de los datos (las clasificaciones se transcriben directamente como sentencias INSERT).</w:t>
+      </w:r>
+    </w:p>
+    <w:p>
+      <w:pPr>
+        <w:pStyle w:val="Listaconvietas"/>
         <w:rPr>
           <w:lang w:val="es-ES"/>
         </w:rPr>
       </w:pPr>
       <w:r>
-        <w:t>Descartada la opción de modificar la configuración de la máquina virtual</w:t>
-      </w:r>
-      <w:r>
-        <w:t xml:space="preserve">, </w:t>
-      </w:r>
-      <w:r>
-        <w:t>fuera del alcance de este trabajo, se comprobó qué alternativas eran compatibles con esa CPU. MariaDB, un motor de base de datos derivado de MySQL con el que comparte protocolo de red y dialecto SQL, sí resultó compatible, por lo que se sustituyó MySQL por mariadb:10.11 en la imagen de datos. Al compartir MariaDB el mismo protocolo de red que MySQL, SQLPage se conecta exactamente igual, y ninguna de las consultas SQL de la aplicación</w:t>
-      </w:r>
-      <w:r>
-        <w:t xml:space="preserve">, </w:t>
-      </w:r>
-      <w:r>
-        <w:t>incluidas las funciones de agregación en JSON empleadas en varios formularios</w:t>
-      </w:r>
-      <w:r>
-        <w:t>,</w:t>
-      </w:r>
-      <w:r>
-        <w:t xml:space="preserve"> tuvo que modificarse.</w:t>
-      </w:r>
-    </w:p>
-    <w:p>
-      <w:pPr>
+        <w:t>SQLite, empleado como motor auxiliar y desechable durante la fase de verificación de los datos, para comprobar de forma automática que cada fichero anual cargaba sin errores de sintaxis ni violaciones de la clave primaria.</w:t>
+      </w:r>
+    </w:p>
+    <w:p>
+      <w:pPr>
+        <w:pStyle w:val="Listaconvietas"/>
         <w:rPr>
           <w:lang w:val="es-ES"/>
         </w:rPr>
       </w:pPr>
       <w:r>
-        <w:t xml:space="preserve">Esta incidencia, aunque anecdótica, ilustra un principio general de cualquier despliegue en un entorno que no se controla por completo: conviene comprobar la compatibilidad real del software en el hardware (o hardware virtualizado) de destino, </w:t>
-      </w:r>
-      <w:r>
-        <w:lastRenderedPageBreak/>
-        <w:t>en lugar de asumir que el mismo comportamiento observado en desarrollo se sostendrá siempre en producción.</w:t>
-      </w:r>
-    </w:p>
-    <w:p>
-      <w:pPr>
-        <w:pStyle w:val="Ttulo1"/>
+        <w:t>MySQL 8 y, tras la incidencia descrita en el apartado 5.4, MariaDB 10.11, como motor de base de datos de la aplicación en producción.</w:t>
+      </w:r>
+    </w:p>
+    <w:p>
+      <w:pPr>
+        <w:pStyle w:val="Listaconvietas"/>
         <w:rPr>
           <w:lang w:val="es-ES"/>
         </w:rPr>
       </w:pPr>
-      <w:bookmarkStart w:id="52" w:name="_Toc239546175"/>
-      <w:r>
-        <w:t>Tecnologías empleadas</w:t>
-      </w:r>
-      <w:bookmarkEnd w:id="52"/>
-    </w:p>
-    <w:p>
-      <w:pPr>
+      <w:r>
+        <w:t>Python, empleado en la fase inicial de exploración de la extracción automática de los cuadernillos (lectura y división de PDF, llamadas a servicios de reconocimiento de documentos y a modelos de lenguaje, generación de SQL a partir de los resultados) y en distintos scripts de apoyo durante el despliegue.</w:t>
+      </w:r>
+    </w:p>
+    <w:p>
+      <w:pPr>
+        <w:pStyle w:val="Ttulo2"/>
         <w:rPr>
           <w:lang w:val="es-ES"/>
         </w:rPr>
       </w:pPr>
-      <w:r>
-        <w:t>Este capítulo recoge, a modo de referencia, las principales tecnologías, lenguajes, bibliotecas y herramientas empleadas a lo largo de todo el trabajo, tanto en la fase de tratamiento de los datos como en la de la aplicación web.</w:t>
+      <w:bookmarkStart w:id="54" w:name="_Toc239595841"/>
+      <w:r>
+        <w:t>SQLPage</w:t>
+      </w:r>
+      <w:bookmarkEnd w:id="54"/>
+    </w:p>
+    <w:p>
+      <w:pPr>
+        <w:rPr>
+          <w:lang w:val="es-ES"/>
+        </w:rPr>
+      </w:pPr>
+      <w:r>
+        <w:t>Motor sobre el que se construye toda la aplicación web: interpreta ficheros .sql como páginas web, traduciendo el resultado de cada consulta en componentes visuales predefinidos (tablas, formularios, tarjetas de cifras, alertas, migas de pan, pestañas) sin necesidad de escribir HTML, JavaScript ni backend propio.</w:t>
       </w:r>
     </w:p>
     <w:p>
@@ -7454,110 +8005,30 @@
           <w:lang w:val="es-ES"/>
         </w:rPr>
       </w:pPr>
-      <w:bookmarkStart w:id="53" w:name="_Toc239546176"/>
-      <w:r>
-        <w:t>Lenguajes y bases de datos</w:t>
-      </w:r>
-      <w:bookmarkEnd w:id="53"/>
-    </w:p>
-    <w:p>
-      <w:pPr>
-        <w:pStyle w:val="Listaconvietas"/>
+      <w:bookmarkStart w:id="55" w:name="_Toc239595842"/>
+      <w:r>
+        <w:t>Docker y Docker Compose</w:t>
+      </w:r>
+      <w:bookmarkEnd w:id="55"/>
+    </w:p>
+    <w:p>
+      <w:pPr>
         <w:rPr>
           <w:lang w:val="es-ES"/>
         </w:rPr>
       </w:pPr>
       <w:r>
-        <w:t>SQL, como lenguaje principal tanto de la aplicación web (todas sus páginas están escritas en SQL) como del propio proceso de digitalización de los datos (las clasificaciones se transcriben directamente como sentencias INSERT).</w:t>
-      </w:r>
-    </w:p>
-    <w:p>
-      <w:pPr>
-        <w:pStyle w:val="Listaconvietas"/>
+        <w:t>Empleados para empaquetar y desplegar tanto la base de datos como la aplicación web de forma reproducible, como se describe en el capítulo 5.</w:t>
+      </w:r>
+    </w:p>
+    <w:p>
+      <w:pPr>
+        <w:pStyle w:val="Ttulo2"/>
         <w:rPr>
           <w:lang w:val="es-ES"/>
         </w:rPr>
       </w:pPr>
-      <w:r>
-        <w:t>SQLite, empleado como motor auxiliar y desechable durante la fase de verificación de los datos, para comprobar de forma automática que cada fichero anual cargaba sin errores de sintaxis ni violaciones de la clave primaria.</w:t>
-      </w:r>
-    </w:p>
-    <w:p>
-      <w:pPr>
-        <w:pStyle w:val="Listaconvietas"/>
-        <w:rPr>
-          <w:lang w:val="es-ES"/>
-        </w:rPr>
-      </w:pPr>
-      <w:r>
-        <w:t>MySQL 8 y, tras la incidencia descrita en el apartado 5.4, MariaDB 10.11, como motor de base de datos de la aplicación en producción.</w:t>
-      </w:r>
-    </w:p>
-    <w:p>
-      <w:pPr>
-        <w:pStyle w:val="Listaconvietas"/>
-        <w:rPr>
-          <w:lang w:val="es-ES"/>
-        </w:rPr>
-      </w:pPr>
-      <w:r>
-        <w:t>Python, empleado en la fase inicial de exploración de la extracción automática de los cuadernillos (lectura y división de PDF, llamadas a servicios de reconocimiento de documentos y a modelos de lenguaje, generación de SQL a partir de los resultados) y en distintos scripts de apoyo durante el despliegue.</w:t>
-      </w:r>
-    </w:p>
-    <w:p>
-      <w:pPr>
-        <w:pStyle w:val="Ttulo2"/>
-        <w:rPr>
-          <w:lang w:val="es-ES"/>
-        </w:rPr>
-      </w:pPr>
-      <w:bookmarkStart w:id="54" w:name="_Toc239546177"/>
-      <w:r>
-        <w:t>SQLPage</w:t>
-      </w:r>
-      <w:bookmarkEnd w:id="54"/>
-    </w:p>
-    <w:p>
-      <w:pPr>
-        <w:rPr>
-          <w:lang w:val="es-ES"/>
-        </w:rPr>
-      </w:pPr>
-      <w:r>
-        <w:t>Motor sobre el que se construye toda la aplicación web: interpreta ficheros .sql como páginas web, traduciendo el resultado de cada consulta en componentes visuales predefinidos (tablas, formularios, tarjetas de cifras, alertas, migas de pan, pestañas) sin necesidad de escribir HTML, JavaScript ni backend propio.</w:t>
-      </w:r>
-    </w:p>
-    <w:p>
-      <w:pPr>
-        <w:pStyle w:val="Ttulo2"/>
-        <w:rPr>
-          <w:lang w:val="es-ES"/>
-        </w:rPr>
-      </w:pPr>
-      <w:bookmarkStart w:id="55" w:name="_Toc239546178"/>
-      <w:r>
-        <w:t>Docker y Docker Compose</w:t>
-      </w:r>
-      <w:bookmarkEnd w:id="55"/>
-    </w:p>
-    <w:p>
-      <w:pPr>
-        <w:rPr>
-          <w:lang w:val="es-ES"/>
-        </w:rPr>
-      </w:pPr>
-      <w:r>
-        <w:t>Empleados para empaquetar y desplegar tanto la base de datos como la aplicación web de forma reproducible, como se describe en el capítulo 5.</w:t>
-      </w:r>
-    </w:p>
-    <w:p>
-      <w:pPr>
-        <w:pStyle w:val="Ttulo2"/>
-        <w:rPr>
-          <w:lang w:val="es-ES"/>
-        </w:rPr>
-      </w:pPr>
-      <w:bookmarkStart w:id="56" w:name="_Toc239546179"/>
+      <w:bookmarkStart w:id="56" w:name="_Toc239595843"/>
       <w:r>
         <w:lastRenderedPageBreak/>
         <w:t>Claude Code</w:t>
@@ -7581,7 +8052,7 @@
           <w:lang w:val="es-ES"/>
         </w:rPr>
       </w:pPr>
-      <w:bookmarkStart w:id="57" w:name="_Toc239546180"/>
+      <w:bookmarkStart w:id="57" w:name="_Toc239595844"/>
       <w:r>
         <w:t>Herramientas exploradas para la digitalización automática y sin supervisión</w:t>
       </w:r>
@@ -7638,7 +8109,7 @@
           <w:lang w:val="es-ES"/>
         </w:rPr>
       </w:pPr>
-      <w:bookmarkStart w:id="58" w:name="_Toc239546181"/>
+      <w:bookmarkStart w:id="58" w:name="_Toc239595845"/>
       <w:r>
         <w:t>Otras herramientas</w:t>
       </w:r>
@@ -7685,7 +8156,7 @@
           <w:lang w:val="es-ES"/>
         </w:rPr>
       </w:pPr>
-      <w:bookmarkStart w:id="59" w:name="_Toc239546182"/>
+      <w:bookmarkStart w:id="59" w:name="_Toc239595846"/>
       <w:r>
         <w:t>Pruebas y resultados</w:t>
       </w:r>
@@ -7708,7 +8179,7 @@
           <w:lang w:val="es-ES"/>
         </w:rPr>
       </w:pPr>
-      <w:bookmarkStart w:id="60" w:name="_Toc239546183"/>
+      <w:bookmarkStart w:id="60" w:name="_Toc239595847"/>
       <w:r>
         <w:t>Verificación de los datos</w:t>
       </w:r>
@@ -7732,7 +8203,7 @@
           <w:lang w:val="es-ES"/>
         </w:rPr>
       </w:pPr>
-      <w:bookmarkStart w:id="61" w:name="_Toc239546184"/>
+      <w:bookmarkStart w:id="61" w:name="_Toc239595848"/>
       <w:r>
         <w:t>Validación de índices con EXPLAIN</w:t>
       </w:r>
@@ -7761,7 +8232,7 @@
           <w:lang w:val="es-ES"/>
         </w:rPr>
       </w:pPr>
-      <w:bookmarkStart w:id="62" w:name="_Toc239546185"/>
+      <w:bookmarkStart w:id="62" w:name="_Toc239595849"/>
       <w:r>
         <w:lastRenderedPageBreak/>
         <w:t>Pruebas funcionales de la aplicación</w:t>
@@ -7836,7 +8307,7 @@
       </w:pPr>
       <w:bookmarkStart w:id="63" w:name="_Ref11684775"/>
       <w:bookmarkStart w:id="64" w:name="_Toc116636446"/>
-      <w:bookmarkStart w:id="65" w:name="_Toc239546186"/>
+      <w:bookmarkStart w:id="65" w:name="_Toc239595850"/>
       <w:bookmarkEnd w:id="63"/>
       <w:bookmarkEnd w:id="64"/>
       <w:r>
@@ -7973,7 +8444,7 @@
         <w:pStyle w:val="EnglishSectionTitle"/>
       </w:pPr>
       <w:bookmarkStart w:id="66" w:name="_Toc116636447"/>
-      <w:bookmarkStart w:id="67" w:name="_Toc239546187"/>
+      <w:bookmarkStart w:id="67" w:name="_Toc239595851"/>
       <w:bookmarkEnd w:id="66"/>
       <w:r>
         <w:lastRenderedPageBreak/>
@@ -8101,7 +8572,21 @@
         <w:rPr>
           <w:lang w:val="en-US"/>
         </w:rPr>
-        <w:t>The goals of this Bachelor's Thesis are the following:</w:t>
+        <w:t xml:space="preserve">The goals of this </w:t>
+      </w:r>
+      <w:proofErr w:type="gramStart"/>
+      <w:r>
+        <w:rPr>
+          <w:lang w:val="en-US"/>
+        </w:rPr>
+        <w:t>Bachelor's</w:t>
+      </w:r>
+      <w:proofErr w:type="gramEnd"/>
+      <w:r>
+        <w:rPr>
+          <w:lang w:val="en-US"/>
+        </w:rPr>
+        <w:t xml:space="preserve"> Thesis are the following:</w:t>
       </w:r>
     </w:p>
     <w:p>
@@ -8304,7 +8789,7 @@
         <w:pStyle w:val="EnglishSectionTitle"/>
       </w:pPr>
       <w:bookmarkStart w:id="68" w:name="_Toc116636448"/>
-      <w:bookmarkStart w:id="69" w:name="_Toc239546188"/>
+      <w:bookmarkStart w:id="69" w:name="_Toc239595852"/>
       <w:bookmarkEnd w:id="68"/>
       <w:r>
         <w:lastRenderedPageBreak/>
@@ -8542,7 +9027,7 @@
         </w:rPr>
       </w:pPr>
       <w:bookmarkStart w:id="72" w:name="_Toc116636450"/>
-      <w:bookmarkStart w:id="73" w:name="_Toc239546189"/>
+      <w:bookmarkStart w:id="73" w:name="_Toc239595853"/>
       <w:proofErr w:type="spellStart"/>
       <w:r>
         <w:lastRenderedPageBreak/>
@@ -8884,35 +9369,7 @@
               <w:rPr>
                 <w:lang w:val="en-US"/>
               </w:rPr>
-              <w:t xml:space="preserve">The </w:t>
-            </w:r>
-            <w:proofErr w:type="spellStart"/>
-            <w:r>
-              <w:rPr>
-                <w:lang w:val="en-US"/>
-              </w:rPr>
-              <w:t>pypdf</w:t>
-            </w:r>
-            <w:proofErr w:type="spellEnd"/>
-            <w:r>
-              <w:rPr>
-                <w:lang w:val="en-US"/>
-              </w:rPr>
-              <w:t xml:space="preserve"> community. </w:t>
-            </w:r>
-            <w:proofErr w:type="spellStart"/>
-            <w:r>
-              <w:rPr>
-                <w:lang w:val="en-US"/>
-              </w:rPr>
-              <w:t>pypdf</w:t>
-            </w:r>
-            <w:proofErr w:type="spellEnd"/>
-            <w:r>
-              <w:rPr>
-                <w:lang w:val="en-US"/>
-              </w:rPr>
-              <w:t xml:space="preserve"> documentation. https://pypdf.readthedocs.io/</w:t>
+              <w:t>The pypdf community. pypdf documentation. https://pypdf.readthedocs.io/</w:t>
             </w:r>
           </w:p>
         </w:tc>
@@ -8992,7 +9449,7 @@
       <w:pPr>
         <w:pStyle w:val="Ttulo6"/>
       </w:pPr>
-      <w:bookmarkStart w:id="75" w:name="_Toc239546190"/>
+      <w:bookmarkStart w:id="75" w:name="_Toc239595854"/>
       <w:bookmarkEnd w:id="74"/>
       <w:r>
         <w:t>Estructura del repositorio y guía de despliegue</w:t>
@@ -9006,8 +9463,34 @@
     </w:p>
     <w:p>
       <w:r>
-        <w:t>El código completo del proyecto —los ficheros SQL con los datos verificados, la aplicación web y las imágenes Docker— está disponible en el siguiente repositorio en línea: [URL DEL REPOSITORIO].</w:t>
-      </w:r>
+        <w:t>El código completo del proyecto</w:t>
+      </w:r>
+      <w:r>
+        <w:t xml:space="preserve">: </w:t>
+      </w:r>
+      <w:r>
+        <w:t>los ficheros SQL con los datos verificados, la aplicación web y las imágenes Docker</w:t>
+      </w:r>
+      <w:r>
+        <w:t>.</w:t>
+      </w:r>
+      <w:r>
+        <w:t xml:space="preserve"> </w:t>
+      </w:r>
+      <w:r>
+        <w:t>E</w:t>
+      </w:r>
+      <w:r>
+        <w:t xml:space="preserve">stá disponible en el siguiente repositorio en línea: </w:t>
+      </w:r>
+      <w:hyperlink r:id="rId21" w:history="1">
+        <w:r>
+          <w:rPr>
+            <w:rStyle w:val="Hipervnculo"/>
+          </w:rPr>
+          <w:t>https://github.com/GaCasado/TFG_GabrielCasado2026</w:t>
+        </w:r>
+      </w:hyperlink>
     </w:p>
     <w:p>
       <w:r>
@@ -9037,7 +9520,13 @@
     </w:p>
     <w:p>
       <w:r>
-        <w:t>El procedimiento es el mismo que en local, sustituyendo las credenciales por unas robustas y generadas específicamente para ese entorno, y activando el modo de producción de SQLPage. Si el motor de base de datos de destino no es compatible con las imágenes oficiales de MySQL —como ocurrió en el despliegue descrito en el apartado 5.4—, basta con sustituir la imagen base por una versión de MariaDB compatible, sin tocar el resto de la configuración.</w:t>
+        <w:t>El procedimiento es el mismo que en local, sustituyendo las credenciales por unas robustas y generadas específicamente para ese entorno, y activando el modo de producción de SQLPage. Si el motor de base de datos de destino no es compatible con las imágenes oficiales de MySQL</w:t>
+      </w:r>
+      <w:r>
+        <w:t xml:space="preserve">, </w:t>
+      </w:r>
+      <w:r>
+        <w:t>como ocurrió en el despliegue descrito en el apartado 5.4, basta con sustituir la imagen base por una versión de MariaDB compatible, sin tocar el resto de la configuración.</w:t>
       </w:r>
     </w:p>
     <w:p/>
@@ -9056,7 +9545,7 @@
       <w:pPr>
         <w:pStyle w:val="Ttulo6"/>
       </w:pPr>
-      <w:bookmarkStart w:id="76" w:name="_Toc239546191"/>
+      <w:bookmarkStart w:id="76" w:name="_Toc239595855"/>
       <w:r>
         <w:lastRenderedPageBreak/>
         <w:t>Resumen de incidencias de normalización de datos</w:t>
@@ -14576,6 +15065,15 @@
       <w:ind w:left="720"/>
       <w:contextualSpacing/>
     </w:pPr>
+  </w:style>
+  <w:style w:type="character" w:styleId="Mencinsinresolver">
+    <w:name w:val="Unresolved Mention"/>
+    <w:basedOn w:val="Fuentedeprrafopredeter"/>
+    <w:rsid w:val="000E423C"/>
+    <w:rPr>
+      <w:color w:val="605E5C"/>
+      <w:shd w:val="clear" w:color="auto" w:fill="E1DFDD"/>
+    </w:rPr>
   </w:style>
 </w:styles>
 </file>

</xml_diff>